<commit_message>
Diagramas: cierra UD 10 con corrutinas, gather, timeouts y backoff (44 en total)
- corrutina-await: await pausa la corrutina y cede el control al event loop
- gather-tareas: tres tareas a la vez, el total es la más lenta y no la suma
- timeout-respaldo: wait_for lanza TimeoutError y el plan B toma el relevo
- backoff-exponencial: las esperas crecen 1, 2, 4, 8 y 16 s
- UD 10 queda con 6 diagramas; inventario y DOCX regenerados
</commit_message>
<xml_diff>
--- a/docx_out/UD 10 - Alta disponibilidad/UD 10 - Apuntes.docx
+++ b/docx_out/UD 10 - Alta disponibilidad/UD 10 - Apuntes.docx
@@ -3197,7 +3197,7 @@
     </w:p>
     <w:bookmarkEnd w:id="32"/>
     <w:bookmarkEnd w:id="33"/>
-    <w:bookmarkStart w:id="40" w:name="corrutinas"/>
+    <w:bookmarkStart w:id="43" w:name="corrutinas"/>
     <w:p>
       <w:pPr>
         <w:pStyle w:val="Heading1"/>
@@ -3374,7 +3374,7 @@
       </w:r>
     </w:p>
     <w:bookmarkEnd w:id="34"/>
-    <w:bookmarkStart w:id="35" w:name="async-def-y-await"/>
+    <w:bookmarkStart w:id="38" w:name="async-def-y-await"/>
     <w:p>
       <w:pPr>
         <w:pStyle w:val="Heading2"/>
@@ -3387,6 +3387,51 @@
       <w:pPr>
         <w:pStyle w:val="FirstParagraph"/>
       </w:pPr>
+      <w:r>
+        <w:drawing>
+          <wp:inline>
+            <wp:extent cx="5334000" cy="2724978"/>
+            <wp:effectExtent b="0" l="0" r="0" t="0"/>
+            <wp:docPr descr="Diagrama de await: la corrutina se pausa en el sleep y devuelve el control al event loop, que la retoma un segundo después" title="" id="36" name="Picture"/>
+            <a:graphic>
+              <a:graphicData uri="http://schemas.openxmlformats.org/drawingml/2006/picture">
+                <pic:pic>
+                  <pic:nvPicPr>
+                    <pic:cNvPr descr="C:/Users/serga/Desktop/ApuntesPSP/docx_out/pngs/corrutina-await.png" id="37" name="Picture"/>
+                    <pic:cNvPicPr>
+                      <a:picLocks noChangeArrowheads="1" noChangeAspect="1"/>
+                    </pic:cNvPicPr>
+                  </pic:nvPicPr>
+                  <pic:blipFill>
+                    <a:blip r:embed="rId35"/>
+                    <a:stretch>
+                      <a:fillRect/>
+                    </a:stretch>
+                  </pic:blipFill>
+                  <pic:spPr bwMode="auto">
+                    <a:xfrm>
+                      <a:off x="0" y="0"/>
+                      <a:ext cx="5334000" cy="2724978"/>
+                    </a:xfrm>
+                    <a:prstGeom prst="rect">
+                      <a:avLst/>
+                    </a:prstGeom>
+                    <a:noFill/>
+                    <a:ln w="9525">
+                      <a:noFill/>
+                      <a:headEnd/>
+                      <a:tailEnd/>
+                    </a:ln>
+                  </pic:spPr>
+                </pic:pic>
+              </a:graphicData>
+            </a:graphic>
+          </wp:inline>
+        </w:drawing>
+      </w:r>
+      <w:r>
+        <w:t xml:space="preserve"> </w:t>
+      </w:r>
       <w:r>
         <w:t xml:space="preserve">La pieza básica de asyncio:</w:t>
       </w:r>
@@ -3753,8 +3798,8 @@
         </w:pict>
       </w:r>
     </w:p>
-    <w:bookmarkEnd w:id="35"/>
-    <w:bookmarkStart w:id="36" w:name="corrutina-no-es-una-función-normal"/>
+    <w:bookmarkEnd w:id="38"/>
+    <w:bookmarkStart w:id="39" w:name="corrutina-no-es-una-función-normal"/>
     <w:p>
       <w:pPr>
         <w:pStyle w:val="Heading2"/>
@@ -4171,8 +4216,8 @@
         </w:pict>
       </w:r>
     </w:p>
-    <w:bookmarkEnd w:id="36"/>
-    <w:bookmarkStart w:id="37" w:name="mini-chequeo-1"/>
+    <w:bookmarkEnd w:id="39"/>
+    <w:bookmarkStart w:id="40" w:name="mini-chequeo-1"/>
     <w:p>
       <w:pPr>
         <w:pStyle w:val="Heading2"/>
@@ -4491,8 +4536,8 @@
         </w:pict>
       </w:r>
     </w:p>
-    <w:bookmarkEnd w:id="37"/>
-    <w:bookmarkStart w:id="38" w:name="resumen-en-3-frases-1"/>
+    <w:bookmarkEnd w:id="40"/>
+    <w:bookmarkStart w:id="41" w:name="resumen-en-3-frases-1"/>
     <w:p>
       <w:pPr>
         <w:pStyle w:val="Heading2"/>
@@ -4601,8 +4646,8 @@
         <w:t xml:space="preserve">o programarla dentro de otra corrutina.</w:t>
       </w:r>
     </w:p>
-    <w:bookmarkEnd w:id="38"/>
-    <w:bookmarkStart w:id="39" w:name="vocabulario-rápido-1"/>
+    <w:bookmarkEnd w:id="41"/>
+    <w:bookmarkStart w:id="42" w:name="vocabulario-rápido-1"/>
     <w:p>
       <w:pPr>
         <w:pStyle w:val="Heading2"/>
@@ -4880,9 +4925,9 @@
         </w:r>
       </w:hyperlink>
     </w:p>
-    <w:bookmarkEnd w:id="39"/>
-    <w:bookmarkEnd w:id="40"/>
-    <w:bookmarkStart w:id="47" w:name="create_task-y-gather"/>
+    <w:bookmarkEnd w:id="42"/>
+    <w:bookmarkEnd w:id="43"/>
+    <w:bookmarkStart w:id="53" w:name="create_task-y-gather"/>
     <w:p>
       <w:pPr>
         <w:pStyle w:val="Heading1"/>
@@ -4996,7 +5041,7 @@
         </w:pict>
       </w:r>
     </w:p>
-    <w:bookmarkStart w:id="41" w:name="la-idea-en-una-frase-2"/>
+    <w:bookmarkStart w:id="44" w:name="la-idea-en-una-frase-2"/>
     <w:p>
       <w:pPr>
         <w:pStyle w:val="Heading2"/>
@@ -5076,8 +5121,8 @@
         </w:pict>
       </w:r>
     </w:p>
-    <w:bookmarkEnd w:id="41"/>
-    <w:bookmarkStart w:id="42" w:name="asyncio.gather-todas-a-la-vez"/>
+    <w:bookmarkEnd w:id="44"/>
+    <w:bookmarkStart w:id="48" w:name="asyncio.gather-todas-a-la-vez"/>
     <w:p>
       <w:pPr>
         <w:pStyle w:val="Heading2"/>
@@ -5090,6 +5135,51 @@
       <w:pPr>
         <w:pStyle w:val="FirstParagraph"/>
       </w:pPr>
+      <w:r>
+        <w:drawing>
+          <wp:inline>
+            <wp:extent cx="5334000" cy="2012830"/>
+            <wp:effectExtent b="0" l="0" r="0" t="0"/>
+            <wp:docPr descr="Diagrama de gather: tres tareas A, B y C corren a la vez y el tiempo total es el de la más lenta, no la suma" title="" id="46" name="Picture"/>
+            <a:graphic>
+              <a:graphicData uri="http://schemas.openxmlformats.org/drawingml/2006/picture">
+                <pic:pic>
+                  <pic:nvPicPr>
+                    <pic:cNvPr descr="C:/Users/serga/Desktop/ApuntesPSP/docx_out/pngs/gather-tareas.png" id="47" name="Picture"/>
+                    <pic:cNvPicPr>
+                      <a:picLocks noChangeArrowheads="1" noChangeAspect="1"/>
+                    </pic:cNvPicPr>
+                  </pic:nvPicPr>
+                  <pic:blipFill>
+                    <a:blip r:embed="rId45"/>
+                    <a:stretch>
+                      <a:fillRect/>
+                    </a:stretch>
+                  </pic:blipFill>
+                  <pic:spPr bwMode="auto">
+                    <a:xfrm>
+                      <a:off x="0" y="0"/>
+                      <a:ext cx="5334000" cy="2012830"/>
+                    </a:xfrm>
+                    <a:prstGeom prst="rect">
+                      <a:avLst/>
+                    </a:prstGeom>
+                    <a:noFill/>
+                    <a:ln w="9525">
+                      <a:noFill/>
+                      <a:headEnd/>
+                      <a:tailEnd/>
+                    </a:ln>
+                  </pic:spPr>
+                </pic:pic>
+              </a:graphicData>
+            </a:graphic>
+          </wp:inline>
+        </w:drawing>
+      </w:r>
+      <w:r>
+        <w:t xml:space="preserve"> </w:t>
+      </w:r>
       <w:r>
         <w:t xml:space="preserve">Del</w:t>
       </w:r>
@@ -5704,8 +5794,8 @@
         </w:pict>
       </w:r>
     </w:p>
-    <w:bookmarkEnd w:id="42"/>
-    <w:bookmarkStart w:id="43" w:name="asyncio.create_task-en-segundo-plano"/>
+    <w:bookmarkEnd w:id="48"/>
+    <w:bookmarkStart w:id="49" w:name="asyncio.create_task-en-segundo-plano"/>
     <w:p>
       <w:pPr>
         <w:pStyle w:val="Heading2"/>
@@ -6406,8 +6496,8 @@
         </w:pict>
       </w:r>
     </w:p>
-    <w:bookmarkEnd w:id="43"/>
-    <w:bookmarkStart w:id="44" w:name="mini-chequeo-2"/>
+    <w:bookmarkEnd w:id="49"/>
+    <w:bookmarkStart w:id="50" w:name="mini-chequeo-2"/>
     <w:p>
       <w:pPr>
         <w:pStyle w:val="Heading2"/>
@@ -6650,8 +6740,8 @@
         </w:pict>
       </w:r>
     </w:p>
-    <w:bookmarkEnd w:id="44"/>
-    <w:bookmarkStart w:id="45" w:name="resumen-en-3-frases-2"/>
+    <w:bookmarkEnd w:id="50"/>
+    <w:bookmarkStart w:id="51" w:name="resumen-en-3-frases-2"/>
     <w:p>
       <w:pPr>
         <w:pStyle w:val="Heading2"/>
@@ -6743,8 +6833,8 @@
         <w:t xml:space="preserve">La concurrencia de asyncio reduce el tiempo total al de la tarea más lenta, no a la suma.</w:t>
       </w:r>
     </w:p>
-    <w:bookmarkEnd w:id="45"/>
-    <w:bookmarkStart w:id="46" w:name="vocabulario-rápido-2"/>
+    <w:bookmarkEnd w:id="51"/>
+    <w:bookmarkStart w:id="52" w:name="vocabulario-rápido-2"/>
     <w:p>
       <w:pPr>
         <w:pStyle w:val="Heading2"/>
@@ -6992,9 +7082,9 @@
         </w:r>
       </w:hyperlink>
     </w:p>
-    <w:bookmarkEnd w:id="46"/>
-    <w:bookmarkEnd w:id="47"/>
-    <w:bookmarkStart w:id="54" w:name="timeouts"/>
+    <w:bookmarkEnd w:id="52"/>
+    <w:bookmarkEnd w:id="53"/>
+    <w:bookmarkStart w:id="63" w:name="timeouts"/>
     <w:p>
       <w:pPr>
         <w:pStyle w:val="Heading1"/>
@@ -7084,7 +7174,7 @@
         </w:pict>
       </w:r>
     </w:p>
-    <w:bookmarkStart w:id="48" w:name="la-idea-en-una-frase-3"/>
+    <w:bookmarkStart w:id="54" w:name="la-idea-en-una-frase-3"/>
     <w:p>
       <w:pPr>
         <w:pStyle w:val="Heading2"/>
@@ -7154,8 +7244,8 @@
         </w:pict>
       </w:r>
     </w:p>
-    <w:bookmarkEnd w:id="48"/>
-    <w:bookmarkStart w:id="49" w:name="el-problema-del-cuelgue"/>
+    <w:bookmarkEnd w:id="54"/>
+    <w:bookmarkStart w:id="55" w:name="el-problema-del-cuelgue"/>
     <w:p>
       <w:pPr>
         <w:pStyle w:val="Heading2"/>
@@ -7585,8 +7675,8 @@
         </w:pict>
       </w:r>
     </w:p>
-    <w:bookmarkEnd w:id="49"/>
-    <w:bookmarkStart w:id="50" w:name="wait_for-con-respaldo"/>
+    <w:bookmarkEnd w:id="55"/>
+    <w:bookmarkStart w:id="59" w:name="wait_for-con-respaldo"/>
     <w:p>
       <w:pPr>
         <w:pStyle w:val="Heading2"/>
@@ -7599,6 +7689,51 @@
       <w:pPr>
         <w:pStyle w:val="FirstParagraph"/>
       </w:pPr>
+      <w:r>
+        <w:drawing>
+          <wp:inline>
+            <wp:extent cx="5334000" cy="2449285"/>
+            <wp:effectExtent b="0" l="0" r="0" t="0"/>
+            <wp:docPr descr="Diagrama de wait_for con respaldo: la tarea lenta supera el timeout de 5 s, salta TimeoutError y el plan B toma el relevo" title="" id="57" name="Picture"/>
+            <a:graphic>
+              <a:graphicData uri="http://schemas.openxmlformats.org/drawingml/2006/picture">
+                <pic:pic>
+                  <pic:nvPicPr>
+                    <pic:cNvPr descr="C:/Users/serga/Desktop/ApuntesPSP/docx_out/pngs/timeout-respaldo.png" id="58" name="Picture"/>
+                    <pic:cNvPicPr>
+                      <a:picLocks noChangeArrowheads="1" noChangeAspect="1"/>
+                    </pic:cNvPicPr>
+                  </pic:nvPicPr>
+                  <pic:blipFill>
+                    <a:blip r:embed="rId56"/>
+                    <a:stretch>
+                      <a:fillRect/>
+                    </a:stretch>
+                  </pic:blipFill>
+                  <pic:spPr bwMode="auto">
+                    <a:xfrm>
+                      <a:off x="0" y="0"/>
+                      <a:ext cx="5334000" cy="2449285"/>
+                    </a:xfrm>
+                    <a:prstGeom prst="rect">
+                      <a:avLst/>
+                    </a:prstGeom>
+                    <a:noFill/>
+                    <a:ln w="9525">
+                      <a:noFill/>
+                      <a:headEnd/>
+                      <a:tailEnd/>
+                    </a:ln>
+                  </pic:spPr>
+                </pic:pic>
+              </a:graphicData>
+            </a:graphic>
+          </wp:inline>
+        </w:drawing>
+      </w:r>
+      <w:r>
+        <w:t xml:space="preserve"> </w:t>
+      </w:r>
       <w:r>
         <w:t xml:space="preserve">El patrón del</w:t>
       </w:r>
@@ -8058,8 +8193,8 @@
         </w:pict>
       </w:r>
     </w:p>
-    <w:bookmarkEnd w:id="50"/>
-    <w:bookmarkStart w:id="51" w:name="mini-chequeo-3"/>
+    <w:bookmarkEnd w:id="59"/>
+    <w:bookmarkStart w:id="60" w:name="mini-chequeo-3"/>
     <w:p>
       <w:pPr>
         <w:pStyle w:val="Heading2"/>
@@ -8237,8 +8372,8 @@
         </w:pict>
       </w:r>
     </w:p>
-    <w:bookmarkEnd w:id="51"/>
-    <w:bookmarkStart w:id="52" w:name="resumen-en-3-frases-3"/>
+    <w:bookmarkEnd w:id="60"/>
+    <w:bookmarkStart w:id="61" w:name="resumen-en-3-frases-3"/>
     <w:p>
       <w:pPr>
         <w:pStyle w:val="Heading2"/>
@@ -8336,8 +8471,8 @@
         <w:t xml:space="preserve">: un servicio que no se cuelga está disponible.</w:t>
       </w:r>
     </w:p>
-    <w:bookmarkEnd w:id="52"/>
-    <w:bookmarkStart w:id="53" w:name="vocabulario-rápido-3"/>
+    <w:bookmarkEnd w:id="61"/>
+    <w:bookmarkStart w:id="62" w:name="vocabulario-rápido-3"/>
     <w:p>
       <w:pPr>
         <w:pStyle w:val="Heading2"/>
@@ -8584,9 +8719,9 @@
         </w:r>
       </w:hyperlink>
     </w:p>
-    <w:bookmarkEnd w:id="53"/>
-    <w:bookmarkEnd w:id="54"/>
-    <w:bookmarkStart w:id="64" w:name="heartbeat"/>
+    <w:bookmarkEnd w:id="62"/>
+    <w:bookmarkEnd w:id="63"/>
+    <w:bookmarkStart w:id="73" w:name="heartbeat"/>
     <w:p>
       <w:pPr>
         <w:pStyle w:val="Heading1"/>
@@ -8676,7 +8811,7 @@
         </w:pict>
       </w:r>
     </w:p>
-    <w:bookmarkStart w:id="55" w:name="la-idea-en-una-frase-4"/>
+    <w:bookmarkStart w:id="64" w:name="la-idea-en-una-frase-4"/>
     <w:p>
       <w:pPr>
         <w:pStyle w:val="Heading2"/>
@@ -8716,8 +8851,8 @@
         </w:pict>
       </w:r>
     </w:p>
-    <w:bookmarkEnd w:id="55"/>
-    <w:bookmarkStart w:id="59" w:name="el-latido-en-asyncio"/>
+    <w:bookmarkEnd w:id="64"/>
+    <w:bookmarkStart w:id="68" w:name="el-latido-en-asyncio"/>
     <w:p>
       <w:pPr>
         <w:pStyle w:val="Heading2"/>
@@ -8815,18 +8950,18 @@
           <wp:inline>
             <wp:extent cx="5334000" cy="2719294"/>
             <wp:effectExtent b="0" l="0" r="0" t="0"/>
-            <wp:docPr descr="Diagrama del heartbeat: el servidor envía latidos periódicos al monitor y, si los latidos se detienen, salta la alerta" title="" id="57" name="Picture"/>
+            <wp:docPr descr="Diagrama del heartbeat: el servidor envía latidos periódicos al monitor y, si los latidos se detienen, salta la alerta" title="" id="66" name="Picture"/>
             <a:graphic>
               <a:graphicData uri="http://schemas.openxmlformats.org/drawingml/2006/picture">
                 <pic:pic>
                   <pic:nvPicPr>
-                    <pic:cNvPr descr="C:/Users/serga/Desktop/ApuntesPSP/docx_out/pngs/heartbeat.png" id="58" name="Picture"/>
+                    <pic:cNvPr descr="C:/Users/serga/Desktop/ApuntesPSP/docx_out/pngs/heartbeat.png" id="67" name="Picture"/>
                     <pic:cNvPicPr>
                       <a:picLocks noChangeArrowheads="1" noChangeAspect="1"/>
                     </pic:cNvPicPr>
                   </pic:nvPicPr>
                   <pic:blipFill>
-                    <a:blip r:embed="rId56"/>
+                    <a:blip r:embed="rId65"/>
                     <a:stretch>
                       <a:fillRect/>
                     </a:stretch>
@@ -9349,8 +9484,8 @@
         </w:pict>
       </w:r>
     </w:p>
-    <w:bookmarkEnd w:id="59"/>
-    <w:bookmarkStart w:id="60" w:name="heartbeat-con-estado"/>
+    <w:bookmarkEnd w:id="68"/>
+    <w:bookmarkStart w:id="69" w:name="heartbeat-con-estado"/>
     <w:p>
       <w:pPr>
         <w:pStyle w:val="Heading2"/>
@@ -9844,8 +9979,8 @@
         </w:pict>
       </w:r>
     </w:p>
-    <w:bookmarkEnd w:id="60"/>
-    <w:bookmarkStart w:id="61" w:name="mini-chequeo-4"/>
+    <w:bookmarkEnd w:id="69"/>
+    <w:bookmarkStart w:id="70" w:name="mini-chequeo-4"/>
     <w:p>
       <w:pPr>
         <w:pStyle w:val="Heading2"/>
@@ -10055,8 +10190,8 @@
         </w:pict>
       </w:r>
     </w:p>
-    <w:bookmarkEnd w:id="61"/>
-    <w:bookmarkStart w:id="62" w:name="resumen-en-3-frases-4"/>
+    <w:bookmarkEnd w:id="70"/>
+    <w:bookmarkStart w:id="71" w:name="resumen-en-3-frases-4"/>
     <w:p>
       <w:pPr>
         <w:pStyle w:val="Heading2"/>
@@ -10161,8 +10296,8 @@
         <w:t xml:space="preserve">(conexiones, errores) lo convierte en vigilancia real de disponibilidad.</w:t>
       </w:r>
     </w:p>
-    <w:bookmarkEnd w:id="62"/>
-    <w:bookmarkStart w:id="63" w:name="vocabulario-rápido-4"/>
+    <w:bookmarkEnd w:id="71"/>
+    <w:bookmarkStart w:id="72" w:name="vocabulario-rápido-4"/>
     <w:p>
       <w:pPr>
         <w:pStyle w:val="Heading2"/>
@@ -10431,9 +10566,9 @@
         </w:r>
       </w:hyperlink>
     </w:p>
-    <w:bookmarkEnd w:id="63"/>
-    <w:bookmarkEnd w:id="64"/>
-    <w:bookmarkStart w:id="71" w:name="backoff"/>
+    <w:bookmarkEnd w:id="72"/>
+    <w:bookmarkEnd w:id="73"/>
+    <w:bookmarkStart w:id="83" w:name="backoff"/>
     <w:p>
       <w:pPr>
         <w:pStyle w:val="Heading1"/>
@@ -10523,7 +10658,7 @@
         </w:pict>
       </w:r>
     </w:p>
-    <w:bookmarkStart w:id="65" w:name="la-idea-en-una-frase-5"/>
+    <w:bookmarkStart w:id="74" w:name="la-idea-en-una-frase-5"/>
     <w:p>
       <w:pPr>
         <w:pStyle w:val="Heading2"/>
@@ -10563,8 +10698,8 @@
         </w:pict>
       </w:r>
     </w:p>
-    <w:bookmarkEnd w:id="65"/>
-    <w:bookmarkStart w:id="66" w:name="el-problema-reintentar-sin-piedad"/>
+    <w:bookmarkEnd w:id="74"/>
+    <w:bookmarkStart w:id="75" w:name="el-problema-reintentar-sin-piedad"/>
     <w:p>
       <w:pPr>
         <w:pStyle w:val="Heading2"/>
@@ -11217,14 +11352,1064 @@
         </w:pict>
       </w:r>
     </w:p>
-    <w:bookmarkEnd w:id="66"/>
-    <w:bookmarkStart w:id="67" w:name="la-secuencia-del-backoff"/>
+    <w:bookmarkEnd w:id="75"/>
+    <w:bookmarkStart w:id="79" w:name="la-secuencia-del-backoff"/>
     <w:p>
       <w:pPr>
         <w:pStyle w:val="Heading2"/>
       </w:pPr>
       <w:r>
         <w:t xml:space="preserve">🔢 La secuencia del backoff</w:t>
+      </w:r>
+    </w:p>
+    <w:p>
+      <w:pPr>
+        <w:pStyle w:val="FirstParagraph"/>
+      </w:pPr>
+      <w:r>
+        <w:drawing>
+          <wp:inline>
+            <wp:extent cx="5334000" cy="3026595"/>
+            <wp:effectExtent b="0" l="0" r="0" t="0"/>
+            <wp:docPr descr="Diagrama del backoff exponencial: las esperas crecen 1, 2, 4, 8 y 16 segundos en cada reintento" title="" id="77" name="Picture"/>
+            <a:graphic>
+              <a:graphicData uri="http://schemas.openxmlformats.org/drawingml/2006/picture">
+                <pic:pic>
+                  <pic:nvPicPr>
+                    <pic:cNvPr descr="C:/Users/serga/Desktop/ApuntesPSP/docx_out/pngs/backoff-exponencial.png" id="78" name="Picture"/>
+                    <pic:cNvPicPr>
+                      <a:picLocks noChangeArrowheads="1" noChangeAspect="1"/>
+                    </pic:cNvPicPr>
+                  </pic:nvPicPr>
+                  <pic:blipFill>
+                    <a:blip r:embed="rId76"/>
+                    <a:stretch>
+                      <a:fillRect/>
+                    </a:stretch>
+                  </pic:blipFill>
+                  <pic:spPr bwMode="auto">
+                    <a:xfrm>
+                      <a:off x="0" y="0"/>
+                      <a:ext cx="5334000" cy="3026595"/>
+                    </a:xfrm>
+                    <a:prstGeom prst="rect">
+                      <a:avLst/>
+                    </a:prstGeom>
+                    <a:noFill/>
+                    <a:ln w="9525">
+                      <a:noFill/>
+                      <a:headEnd/>
+                      <a:tailEnd/>
+                    </a:ln>
+                  </pic:spPr>
+                </pic:pic>
+              </a:graphicData>
+            </a:graphic>
+          </wp:inline>
+        </w:drawing>
+      </w:r>
+      <w:r>
+        <w:t xml:space="preserve"> </w:t>
+      </w:r>
+      <w:r>
+        <w:t xml:space="preserve">| Intento | Espera (2 ** intento) | Acumulado |</w:t>
+      </w:r>
+      <w:r>
+        <w:t xml:space="preserve"> </w:t>
+      </w:r>
+      <w:r>
+        <w:t xml:space="preserve">|—|—|—|</w:t>
+      </w:r>
+      <w:r>
+        <w:t xml:space="preserve"> </w:t>
+      </w:r>
+      <w:r>
+        <w:t xml:space="preserve">| 0 | 1s | 1s |</w:t>
+      </w:r>
+      <w:r>
+        <w:t xml:space="preserve"> </w:t>
+      </w:r>
+      <w:r>
+        <w:t xml:space="preserve">| 1 | 2s | 3s |</w:t>
+      </w:r>
+      <w:r>
+        <w:t xml:space="preserve"> </w:t>
+      </w:r>
+      <w:r>
+        <w:t xml:space="preserve">| 2 | 4s | 7s |</w:t>
+      </w:r>
+      <w:r>
+        <w:t xml:space="preserve"> </w:t>
+      </w:r>
+      <w:r>
+        <w:t xml:space="preserve">| 3 | 8s | 15s |</w:t>
+      </w:r>
+      <w:r>
+        <w:t xml:space="preserve"> </w:t>
+      </w:r>
+      <w:r>
+        <w:t xml:space="preserve">| 4 | 16s | 31s |</w:t>
+      </w:r>
+    </w:p>
+    <w:p>
+      <w:pPr>
+        <w:pStyle w:val="BlockText"/>
+      </w:pPr>
+      <w:r>
+        <w:t xml:space="preserve">El</w:t>
+      </w:r>
+      <w:r>
+        <w:t xml:space="preserve"> </w:t>
+      </w:r>
+      <w:r>
+        <w:rPr>
+          <w:b/>
+          <w:bCs/>
+        </w:rPr>
+        <w:t xml:space="preserve">backoff exponencial</w:t>
+      </w:r>
+      <w:r>
+        <w:t xml:space="preserve"> </w:t>
+      </w:r>
+      <w:r>
+        <w:t xml:space="preserve">evita saturar un servidor que ya está teniendo problemas. Es la diferencia entre</w:t>
+      </w:r>
+      <w:r>
+        <w:t xml:space="preserve"> </w:t>
+      </w:r>
+      <w:r>
+        <w:t xml:space="preserve">“un cliente molesto”</w:t>
+      </w:r>
+      <w:r>
+        <w:t xml:space="preserve"> </w:t>
+      </w:r>
+      <w:r>
+        <w:t xml:space="preserve">y</w:t>
+      </w:r>
+      <w:r>
+        <w:t xml:space="preserve"> </w:t>
+      </w:r>
+      <w:r>
+        <w:t xml:space="preserve">“un cliente que remata al servidor”</w:t>
+      </w:r>
+      <w:r>
+        <w:t xml:space="preserve">.</w:t>
+      </w:r>
+    </w:p>
+    <w:p>
+      <w:r>
+        <w:pict>
+          <v:rect style="width:0;height:1.5pt" o:hralign="center" o:hrstd="t" o:hr="t"/>
+        </w:pict>
+      </w:r>
+    </w:p>
+    <w:bookmarkEnd w:id="79"/>
+    <w:bookmarkStart w:id="80" w:name="mini-chequeo-5"/>
+    <w:p>
+      <w:pPr>
+        <w:pStyle w:val="Heading2"/>
+      </w:pPr>
+      <w:r>
+        <w:t xml:space="preserve">🧠 Mini-chequeo</w:t>
+      </w:r>
+    </w:p>
+    <w:p>
+      <w:pPr>
+        <w:pStyle w:val="Compact"/>
+        <w:numPr>
+          <w:ilvl w:val="0"/>
+          <w:numId w:val="1018"/>
+        </w:numPr>
+      </w:pPr>
+      <w:r>
+        <w:t xml:space="preserve">¿Qué secuencia de espera genera</w:t>
+      </w:r>
+      <w:r>
+        <w:t xml:space="preserve"> </w:t>
+      </w:r>
+      <w:r>
+        <w:rPr>
+          <w:rStyle w:val="VerbatimChar"/>
+        </w:rPr>
+        <w:t xml:space="preserve">2 ** intento</w:t>
+      </w:r>
+      <w:r>
+        <w:t xml:space="preserve"> </w:t>
+      </w:r>
+      <w:r>
+        <w:t xml:space="preserve">con 4 reintentos?</w:t>
+      </w:r>
+    </w:p>
+    <w:p>
+      <w:pPr>
+        <w:pStyle w:val="Compact"/>
+        <w:numPr>
+          <w:ilvl w:val="0"/>
+          <w:numId w:val="1018"/>
+        </w:numPr>
+      </w:pPr>
+      <w:r>
+        <w:t xml:space="preserve">¿Qué dos excepciones captura el ejemplo?</w:t>
+      </w:r>
+    </w:p>
+    <w:p>
+      <w:pPr>
+        <w:pStyle w:val="Compact"/>
+        <w:numPr>
+          <w:ilvl w:val="0"/>
+          <w:numId w:val="1018"/>
+        </w:numPr>
+      </w:pPr>
+      <w:r>
+        <w:t xml:space="preserve">¿Por qué es mejor que reintentar sin espera?</w:t>
+      </w:r>
+    </w:p>
+    <w:p>
+      <w:pPr>
+        <w:pStyle w:val="FirstParagraph"/>
+      </w:pPr>
+      <w:r>
+        <w:t xml:space="preserve">🔄 Respuestas</w:t>
+      </w:r>
+    </w:p>
+    <w:p>
+      <w:pPr>
+        <w:pStyle w:val="Compact"/>
+        <w:numPr>
+          <w:ilvl w:val="0"/>
+          <w:numId w:val="1019"/>
+        </w:numPr>
+      </w:pPr>
+      <w:r>
+        <w:rPr>
+          <w:b/>
+          <w:bCs/>
+        </w:rPr>
+        <w:t xml:space="preserve">1, 2, 4, 8 segundos</w:t>
+      </w:r>
+      <w:r>
+        <w:t xml:space="preserve"> </w:t>
+      </w:r>
+      <w:r>
+        <w:t xml:space="preserve">(y el siguiente sería 16).</w:t>
+      </w:r>
+    </w:p>
+    <w:p>
+      <w:pPr>
+        <w:pStyle w:val="Compact"/>
+        <w:numPr>
+          <w:ilvl w:val="0"/>
+          <w:numId w:val="1019"/>
+        </w:numPr>
+      </w:pPr>
+      <w:r>
+        <w:rPr>
+          <w:rStyle w:val="VerbatimChar"/>
+          <w:b/>
+          <w:bCs/>
+        </w:rPr>
+        <w:t xml:space="preserve">asyncio.TimeoutError</w:t>
+      </w:r>
+      <w:r>
+        <w:t xml:space="preserve"> </w:t>
+      </w:r>
+      <w:r>
+        <w:t xml:space="preserve">(el</w:t>
+      </w:r>
+      <w:r>
+        <w:t xml:space="preserve"> </w:t>
+      </w:r>
+      <w:r>
+        <w:rPr>
+          <w:rStyle w:val="VerbatimChar"/>
+        </w:rPr>
+        <w:t xml:space="preserve">wait_for</w:t>
+      </w:r>
+      <w:r>
+        <w:t xml:space="preserve"> </w:t>
+      </w:r>
+      <w:r>
+        <w:t xml:space="preserve">de 3s) y</w:t>
+      </w:r>
+      <w:r>
+        <w:t xml:space="preserve"> </w:t>
+      </w:r>
+      <w:r>
+        <w:rPr>
+          <w:rStyle w:val="VerbatimChar"/>
+          <w:b/>
+          <w:bCs/>
+        </w:rPr>
+        <w:t xml:space="preserve">ConnectionRefusedError</w:t>
+      </w:r>
+      <w:r>
+        <w:t xml:space="preserve"> </w:t>
+      </w:r>
+      <w:r>
+        <w:t xml:space="preserve">(el servicio no escucha).</w:t>
+      </w:r>
+    </w:p>
+    <w:p>
+      <w:pPr>
+        <w:pStyle w:val="Compact"/>
+        <w:numPr>
+          <w:ilvl w:val="0"/>
+          <w:numId w:val="1019"/>
+        </w:numPr>
+      </w:pPr>
+      <w:r>
+        <w:t xml:space="preserve">Porque</w:t>
+      </w:r>
+      <w:r>
+        <w:t xml:space="preserve"> </w:t>
+      </w:r>
+      <w:r>
+        <w:rPr>
+          <w:b/>
+          <w:bCs/>
+        </w:rPr>
+        <w:t xml:space="preserve">no machaca al servidor caído</w:t>
+      </w:r>
+      <w:r>
+        <w:t xml:space="preserve">: con espera creciente le das tiempo a recuperarse y a la vez no abandonas. Si se reintenta a saco, se puede hundir el servicio.</w:t>
+      </w:r>
+    </w:p>
+    <w:p>
+      <w:r>
+        <w:pict>
+          <v:rect style="width:0;height:1.5pt" o:hralign="center" o:hrstd="t" o:hr="t"/>
+        </w:pict>
+      </w:r>
+    </w:p>
+    <w:bookmarkEnd w:id="80"/>
+    <w:bookmarkStart w:id="81" w:name="resumen-en-3-frases-5"/>
+    <w:p>
+      <w:pPr>
+        <w:pStyle w:val="Heading2"/>
+      </w:pPr>
+      <w:r>
+        <w:t xml:space="preserve">✅ Resumen en 3 frases</w:t>
+      </w:r>
+    </w:p>
+    <w:p>
+      <w:pPr>
+        <w:pStyle w:val="Compact"/>
+        <w:numPr>
+          <w:ilvl w:val="0"/>
+          <w:numId w:val="1020"/>
+        </w:numPr>
+      </w:pPr>
+      <w:r>
+        <w:t xml:space="preserve">El backoff exponencial reintenta con</w:t>
+      </w:r>
+      <w:r>
+        <w:t xml:space="preserve"> </w:t>
+      </w:r>
+      <w:r>
+        <w:rPr>
+          <w:b/>
+          <w:bCs/>
+        </w:rPr>
+        <w:t xml:space="preserve">espera creciente</w:t>
+      </w:r>
+      <w:r>
+        <w:t xml:space="preserve"> </w:t>
+      </w:r>
+      <w:r>
+        <w:t xml:space="preserve">(</w:t>
+      </w:r>
+      <w:r>
+        <w:rPr>
+          <w:rStyle w:val="VerbatimChar"/>
+        </w:rPr>
+        <w:t xml:space="preserve">2 ** intento</w:t>
+      </w:r>
+      <w:r>
+        <w:t xml:space="preserve">).</w:t>
+      </w:r>
+    </w:p>
+    <w:p>
+      <w:pPr>
+        <w:pStyle w:val="Compact"/>
+        <w:numPr>
+          <w:ilvl w:val="0"/>
+          <w:numId w:val="1020"/>
+        </w:numPr>
+      </w:pPr>
+      <w:r>
+        <w:t xml:space="preserve">Se combina con</w:t>
+      </w:r>
+      <w:r>
+        <w:t xml:space="preserve"> </w:t>
+      </w:r>
+      <w:r>
+        <w:rPr>
+          <w:rStyle w:val="VerbatimChar"/>
+        </w:rPr>
+        <w:t xml:space="preserve">wait_for</w:t>
+      </w:r>
+      <w:r>
+        <w:t xml:space="preserve"> </w:t>
+      </w:r>
+      <w:r>
+        <w:t xml:space="preserve">para que cada intento tenga también un</w:t>
+      </w:r>
+      <w:r>
+        <w:t xml:space="preserve"> </w:t>
+      </w:r>
+      <w:r>
+        <w:rPr>
+          <w:b/>
+          <w:bCs/>
+        </w:rPr>
+        <w:t xml:space="preserve">timeout</w:t>
+      </w:r>
+      <w:r>
+        <w:t xml:space="preserve">.</w:t>
+      </w:r>
+    </w:p>
+    <w:p>
+      <w:pPr>
+        <w:pStyle w:val="Compact"/>
+        <w:numPr>
+          <w:ilvl w:val="0"/>
+          <w:numId w:val="1020"/>
+        </w:numPr>
+      </w:pPr>
+      <w:r>
+        <w:t xml:space="preserve">Es el segundo mecanismo de disponibilidad: el cliente que</w:t>
+      </w:r>
+      <w:r>
+        <w:t xml:space="preserve"> </w:t>
+      </w:r>
+      <w:r>
+        <w:rPr>
+          <w:b/>
+          <w:bCs/>
+        </w:rPr>
+        <w:t xml:space="preserve">aguanta sin machacar</w:t>
+      </w:r>
+      <w:r>
+        <w:t xml:space="preserve">.</w:t>
+      </w:r>
+    </w:p>
+    <w:bookmarkEnd w:id="81"/>
+    <w:bookmarkStart w:id="82" w:name="vocabulario-rápido-5"/>
+    <w:p>
+      <w:pPr>
+        <w:pStyle w:val="Heading2"/>
+      </w:pPr>
+      <w:r>
+        <w:t xml:space="preserve">🐛 Vocabulario rápido</w:t>
+      </w:r>
+    </w:p>
+    <w:tbl>
+      <w:tblPr>
+        <w:tblStyle w:val="Table"/>
+        <w:tblW w:type="pct" w:w="5000"/>
+        <w:tblLayout w:type="fixed"/>
+        <w:tblLook w:firstRow="1" w:lastRow="0" w:firstColumn="0" w:lastColumn="0" w:noHBand="0" w:noVBand="0" w:val="0020"/>
+      </w:tblPr>
+      <w:tblGrid>
+        <w:gridCol w:w="3960"/>
+        <w:gridCol w:w="3960"/>
+      </w:tblGrid>
+      <w:tr>
+        <w:trPr>
+          <w:tblHeader w:val="on"/>
+        </w:trPr>
+        <w:tc>
+          <w:tcPr/>
+          <w:p>
+            <w:pPr>
+              <w:pStyle w:val="Compact"/>
+            </w:pPr>
+            <w:r>
+              <w:t xml:space="preserve">Término</w:t>
+            </w:r>
+          </w:p>
+        </w:tc>
+        <w:tc>
+          <w:tcPr/>
+          <w:p>
+            <w:pPr>
+              <w:pStyle w:val="Compact"/>
+            </w:pPr>
+            <w:r>
+              <w:t xml:space="preserve">Idea general</w:t>
+            </w:r>
+          </w:p>
+        </w:tc>
+      </w:tr>
+      <w:tr>
+        <w:tc>
+          <w:tcPr/>
+          <w:p>
+            <w:pPr>
+              <w:pStyle w:val="Compact"/>
+            </w:pPr>
+            <w:r>
+              <w:t xml:space="preserve">Backoff</w:t>
+            </w:r>
+          </w:p>
+        </w:tc>
+        <w:tc>
+          <w:tcPr/>
+          <w:p>
+            <w:pPr>
+              <w:pStyle w:val="Compact"/>
+            </w:pPr>
+            <w:r>
+              <w:t xml:space="preserve">Reintento con espera creciente entre intentos</w:t>
+            </w:r>
+          </w:p>
+        </w:tc>
+      </w:tr>
+      <w:tr>
+        <w:tc>
+          <w:tcPr/>
+          <w:p>
+            <w:pPr>
+              <w:pStyle w:val="Compact"/>
+            </w:pPr>
+            <w:r>
+              <w:t xml:space="preserve">2 ** intento</w:t>
+            </w:r>
+          </w:p>
+        </w:tc>
+        <w:tc>
+          <w:tcPr/>
+          <w:p>
+            <w:pPr>
+              <w:pStyle w:val="Compact"/>
+            </w:pPr>
+            <w:r>
+              <w:t xml:space="preserve">Fórmula de la espera: 1, 2, 4, 8, 16…</w:t>
+            </w:r>
+          </w:p>
+        </w:tc>
+      </w:tr>
+      <w:tr>
+        <w:tc>
+          <w:tcPr/>
+          <w:p>
+            <w:pPr>
+              <w:pStyle w:val="Compact"/>
+            </w:pPr>
+            <w:r>
+              <w:t xml:space="preserve">ConnectionRefusedError</w:t>
+            </w:r>
+          </w:p>
+        </w:tc>
+        <w:tc>
+          <w:tcPr/>
+          <w:p>
+            <w:pPr>
+              <w:pStyle w:val="Compact"/>
+            </w:pPr>
+            <w:r>
+              <w:t xml:space="preserve">El servicio no escucha en ese puerto</w:t>
+            </w:r>
+          </w:p>
+        </w:tc>
+      </w:tr>
+      <w:tr>
+        <w:tc>
+          <w:tcPr/>
+          <w:p>
+            <w:pPr>
+              <w:pStyle w:val="Compact"/>
+            </w:pPr>
+            <w:r>
+              <w:t xml:space="preserve">Reintento</w:t>
+            </w:r>
+          </w:p>
+        </w:tc>
+        <w:tc>
+          <w:tcPr/>
+          <w:p>
+            <w:pPr>
+              <w:pStyle w:val="Compact"/>
+            </w:pPr>
+            <w:r>
+              <w:t xml:space="preserve">Nueva tentativa tras un fallo</w:t>
+            </w:r>
+          </w:p>
+        </w:tc>
+      </w:tr>
+      <w:tr>
+        <w:tc>
+          <w:tcPr/>
+          <w:p>
+            <w:pPr>
+              <w:pStyle w:val="Compact"/>
+            </w:pPr>
+            <w:r>
+              <w:t xml:space="preserve">Jitter (variación)</w:t>
+            </w:r>
+          </w:p>
+        </w:tc>
+        <w:tc>
+          <w:tcPr/>
+          <w:p>
+            <w:pPr>
+              <w:pStyle w:val="Compact"/>
+            </w:pPr>
+            <w:r>
+              <w:t xml:space="preserve">Añadir aleatoriedad a la espera para evitar avalanchas (tema avanzado)</w:t>
+            </w:r>
+          </w:p>
+        </w:tc>
+      </w:tr>
+    </w:tbl>
+    <w:p>
+      <w:r>
+        <w:pict>
+          <v:rect style="width:0;height:1.5pt" o:hralign="center" o:hrstd="t" o:hr="t"/>
+        </w:pict>
+      </w:r>
+    </w:p>
+    <w:p>
+      <w:pPr>
+        <w:pStyle w:val="FirstParagraph"/>
+      </w:pPr>
+      <w:r>
+        <w:t xml:space="preserve">📚</w:t>
+      </w:r>
+      <w:r>
+        <w:t xml:space="preserve"> </w:t>
+      </w:r>
+      <w:hyperlink r:id="rId31">
+        <w:r>
+          <w:rPr>
+            <w:rStyle w:val="Hyperlink"/>
+          </w:rPr>
+          <w:t xml:space="preserve">Volver al índice de la unidad</w:t>
+        </w:r>
+      </w:hyperlink>
+      <w:r>
+        <w:t xml:space="preserve"> </w:t>
+      </w:r>
+      <w:r>
+        <w:t xml:space="preserve">·</w:t>
+      </w:r>
+      <w:r>
+        <w:t xml:space="preserve"> </w:t>
+      </w:r>
+      <w:r>
+        <w:rPr>
+          <w:b/>
+          <w:bCs/>
+        </w:rPr>
+        <w:t xml:space="preserve">Anterior:</w:t>
+      </w:r>
+      <w:r>
+        <w:t xml:space="preserve"> </w:t>
+      </w:r>
+      <w:hyperlink r:id="rId14">
+        <w:r>
+          <w:rPr>
+            <w:rStyle w:val="Hyperlink"/>
+          </w:rPr>
+          <w:t xml:space="preserve">05 · Heartbeat</w:t>
+        </w:r>
+      </w:hyperlink>
+      <w:r>
+        <w:t xml:space="preserve"> </w:t>
+      </w:r>
+      <w:r>
+        <w:t xml:space="preserve">·</w:t>
+      </w:r>
+      <w:r>
+        <w:t xml:space="preserve"> </w:t>
+      </w:r>
+      <w:r>
+        <w:rPr>
+          <w:b/>
+          <w:bCs/>
+        </w:rPr>
+        <w:t xml:space="preserve">Siguiente:</w:t>
+      </w:r>
+      <w:r>
+        <w:t xml:space="preserve"> </w:t>
+      </w:r>
+      <w:hyperlink r:id="rId16">
+        <w:r>
+          <w:rPr>
+            <w:rStyle w:val="Hyperlink"/>
+          </w:rPr>
+          <w:t xml:space="preserve">07 · Threads vs asyncio</w:t>
+        </w:r>
+      </w:hyperlink>
+    </w:p>
+    <w:bookmarkEnd w:id="82"/>
+    <w:bookmarkEnd w:id="83"/>
+    <w:bookmarkStart w:id="91" w:name="threads-vs-asyncio"/>
+    <w:p>
+      <w:pPr>
+        <w:pStyle w:val="Heading1"/>
+      </w:pPr>
+      <w:r>
+        <w:t xml:space="preserve">07 — Threads vs asyncio</w:t>
+      </w:r>
+    </w:p>
+    <w:p>
+      <w:pPr>
+        <w:pStyle w:val="FirstParagraph"/>
+      </w:pPr>
+      <w:r>
+        <w:t xml:space="preserve">﻿—</w:t>
+      </w:r>
+      <w:r>
+        <w:t xml:space="preserve"> </w:t>
+      </w:r>
+      <w:r>
+        <w:t xml:space="preserve">title: 07 — Threads vs asyncio</w:t>
+      </w:r>
+      <w:r>
+        <w:t xml:space="preserve"> </w:t>
+      </w:r>
+      <w:r>
+        <w:t xml:space="preserve">description: La comparativa definitiva de modelos de concurrencia 🥊</w:t>
+      </w:r>
+      <w:r>
+        <w:t xml:space="preserve"> </w:t>
+      </w:r>
+      <w:r>
+        <w:t xml:space="preserve">—</w:t>
+      </w:r>
+    </w:p>
+    <w:p>
+      <w:pPr>
+        <w:pStyle w:val="BodyText"/>
+      </w:pPr>
+      <w:r>
+        <w:t xml:space="preserve">La comparativa definitiva de modelos de concurrencia 🥊</w:t>
+      </w:r>
+    </w:p>
+    <w:p>
+      <w:pPr>
+        <w:pStyle w:val="BlockText"/>
+      </w:pPr>
+      <w:r>
+        <w:t xml:space="preserve">🗺️</w:t>
+      </w:r>
+      <w:r>
+        <w:t xml:space="preserve"> </w:t>
+      </w:r>
+      <w:r>
+        <w:rPr>
+          <w:b/>
+          <w:bCs/>
+        </w:rPr>
+        <w:t xml:space="preserve">Estás en:</w:t>
+      </w:r>
+      <w:r>
+        <w:t xml:space="preserve"> </w:t>
+      </w:r>
+      <w:r>
+        <w:t xml:space="preserve">⏱️</w:t>
+      </w:r>
+      <w:r>
+        <w:t xml:space="preserve"> </w:t>
+      </w:r>
+      <w:r>
+        <w:rPr>
+          <w:b/>
+          <w:bCs/>
+        </w:rPr>
+        <w:t xml:space="preserve">UD 10 · Alta disponibilidad</w:t>
+      </w:r>
+      <w:r>
+        <w:t xml:space="preserve"> </w:t>
+      </w:r>
+      <w:r>
+        <w:t xml:space="preserve">→ 07 · Threads vs asyncio</w:t>
+      </w:r>
+    </w:p>
+    <w:p>
+      <w:r>
+        <w:pict>
+          <v:rect style="width:0;height:1.5pt" o:hralign="center" o:hrstd="t" o:hr="t"/>
+        </w:pict>
+      </w:r>
+    </w:p>
+    <w:bookmarkStart w:id="84" w:name="la-idea-en-una-frase-6"/>
+    <w:p>
+      <w:pPr>
+        <w:pStyle w:val="Heading2"/>
+      </w:pPr>
+      <w:r>
+        <w:t xml:space="preserve">📬 La idea en una frase</w:t>
+      </w:r>
+    </w:p>
+    <w:p>
+      <w:pPr>
+        <w:pStyle w:val="BlockText"/>
+      </w:pPr>
+      <w:r>
+        <w:t xml:space="preserve">Los</w:t>
+      </w:r>
+      <w:r>
+        <w:t xml:space="preserve"> </w:t>
+      </w:r>
+      <w:r>
+        <w:rPr>
+          <w:b/>
+          <w:bCs/>
+        </w:rPr>
+        <w:t xml:space="preserve">hilos</w:t>
+      </w:r>
+      <w:r>
+        <w:t xml:space="preserve"> </w:t>
+      </w:r>
+      <w:r>
+        <w:t xml:space="preserve">son multitarea de verdad gestionada por el SO;</w:t>
+      </w:r>
+      <w:r>
+        <w:t xml:space="preserve"> </w:t>
+      </w:r>
+      <w:r>
+        <w:rPr>
+          <w:b/>
+          <w:bCs/>
+        </w:rPr>
+        <w:t xml:space="preserve">asyncio</w:t>
+      </w:r>
+      <w:r>
+        <w:t xml:space="preserve"> </w:t>
+      </w:r>
+      <w:r>
+        <w:t xml:space="preserve">es multitarea cooperativa en un solo hilo. Para servidores con mucho I/O y miles de conexiones, asyncio gana; para simplicidad con pocos clientes, los hilos.</w:t>
+      </w:r>
+    </w:p>
+    <w:p>
+      <w:r>
+        <w:pict>
+          <v:rect style="width:0;height:1.5pt" o:hralign="center" o:hrstd="t" o:hr="t"/>
+        </w:pict>
+      </w:r>
+    </w:p>
+    <w:bookmarkEnd w:id="84"/>
+    <w:bookmarkStart w:id="85" w:name="el-ring-de-los-conceptos"/>
+    <w:p>
+      <w:pPr>
+        <w:pStyle w:val="Heading2"/>
+      </w:pPr>
+      <w:r>
+        <w:t xml:space="preserve">🥊 El ring de los conceptos</w:t>
+      </w:r>
+    </w:p>
+    <w:p>
+      <w:pPr>
+        <w:pStyle w:val="FirstParagraph"/>
+      </w:pPr>
+      <w:r>
+        <w:rPr>
+          <w:b/>
+          <w:bCs/>
+        </w:rPr>
+        <w:t xml:space="preserve">Thread</w:t>
+      </w:r>
+      <w:r>
+        <w:t xml:space="preserve">:</w:t>
+      </w:r>
+      <w:r>
+        <w:t xml:space="preserve"> </w:t>
+      </w:r>
+      <w:r>
+        <w:t xml:space="preserve">“Yo soy multitarea de verdad. Tengo mi propia pila, mi propio contexto. El SO me gestiona.”</w:t>
+      </w:r>
+    </w:p>
+    <w:p>
+      <w:pPr>
+        <w:pStyle w:val="BodyText"/>
+      </w:pPr>
+      <w:r>
+        <w:rPr>
+          <w:b/>
+          <w:bCs/>
+        </w:rPr>
+        <w:t xml:space="preserve">Asyncio</w:t>
+      </w:r>
+      <w:r>
+        <w:t xml:space="preserve">:</w:t>
+      </w:r>
+      <w:r>
+        <w:t xml:space="preserve"> </w:t>
+      </w:r>
+      <w:r>
+        <w:t xml:space="preserve">“Yo soy multitarea cooperativa. Un solo hilo, pero cambio de tarea cuando una espera.”</w:t>
+      </w:r>
+    </w:p>
+    <w:p>
+      <w:pPr>
+        <w:pStyle w:val="BodyText"/>
+      </w:pPr>
+      <w:r>
+        <w:rPr>
+          <w:b/>
+          <w:bCs/>
+        </w:rPr>
+        <w:t xml:space="preserve">Thread</w:t>
+      </w:r>
+      <w:r>
+        <w:t xml:space="preserve">:</w:t>
+      </w:r>
+      <w:r>
+        <w:t xml:space="preserve"> </w:t>
+      </w:r>
+      <w:r>
+        <w:t xml:space="preserve">“Si tengo 10.000 clientes, creo 10.000 hilos. El sistema sufre.”</w:t>
+      </w:r>
+    </w:p>
+    <w:p>
+      <w:pPr>
+        <w:pStyle w:val="BodyText"/>
+      </w:pPr>
+      <w:r>
+        <w:rPr>
+          <w:b/>
+          <w:bCs/>
+        </w:rPr>
+        <w:t xml:space="preserve">Asyncio</w:t>
+      </w:r>
+      <w:r>
+        <w:t xml:space="preserve">:</w:t>
+      </w:r>
+      <w:r>
+        <w:t xml:space="preserve"> </w:t>
+      </w:r>
+      <w:r>
+        <w:t xml:space="preserve">“Yo con 10.000 clientes uso un hilo y 10.000 corrutinas. Mucho más ligero.”</w:t>
+      </w:r>
+    </w:p>
+    <w:p>
+      <w:pPr>
+        <w:pStyle w:val="BodyText"/>
+      </w:pPr>
+      <w:r>
+        <w:rPr>
+          <w:b/>
+          <w:bCs/>
+        </w:rPr>
+        <w:t xml:space="preserve">Thread</w:t>
+      </w:r>
+      <w:r>
+        <w:t xml:space="preserve">:</w:t>
+      </w:r>
+      <w:r>
+        <w:t xml:space="preserve"> </w:t>
+      </w:r>
+      <w:r>
+        <w:t xml:space="preserve">“Pero mis operaciones son bloqueantes de verdad. Si llamo a</w:t>
+      </w:r>
+      <w:r>
+        <w:t xml:space="preserve"> </w:t>
+      </w:r>
+      <w:r>
+        <w:rPr>
+          <w:rStyle w:val="VerbatimChar"/>
+        </w:rPr>
+        <w:t xml:space="preserve">time.sleep()</w:t>
+      </w:r>
+      <w:r>
+        <w:t xml:space="preserve">, otro hilo ejecuta.”</w:t>
+      </w:r>
+    </w:p>
+    <w:p>
+      <w:pPr>
+        <w:pStyle w:val="BodyText"/>
+      </w:pPr>
+      <w:r>
+        <w:rPr>
+          <w:b/>
+          <w:bCs/>
+        </w:rPr>
+        <w:t xml:space="preserve">Asyncio</w:t>
+      </w:r>
+      <w:r>
+        <w:t xml:space="preserve">:</w:t>
+      </w:r>
+      <w:r>
+        <w:t xml:space="preserve"> </w:t>
+      </w:r>
+      <w:r>
+        <w:t xml:space="preserve">“Mis operaciones son</w:t>
+      </w:r>
+      <w:r>
+        <w:t xml:space="preserve"> </w:t>
+      </w:r>
+      <w:r>
+        <w:rPr>
+          <w:rStyle w:val="VerbatimChar"/>
+        </w:rPr>
+        <w:t xml:space="preserve">await</w:t>
+      </w:r>
+      <w:r>
+        <w:t xml:space="preserve"> </w:t>
+      </w:r>
+      <w:r>
+        <w:t xml:space="preserve">— nunca bloqueo. El event loop decide qué toca.”</w:t>
+      </w:r>
+    </w:p>
+    <w:p>
+      <w:pPr>
+        <w:pStyle w:val="BodyText"/>
+      </w:pPr>
+      <w:r>
+        <w:rPr>
+          <w:b/>
+          <w:bCs/>
+        </w:rPr>
+        <w:t xml:space="preserve">Thread</w:t>
+      </w:r>
+      <w:r>
+        <w:t xml:space="preserve">:</w:t>
+      </w:r>
+      <w:r>
+        <w:t xml:space="preserve"> </w:t>
+      </w:r>
+      <w:r>
+        <w:t xml:space="preserve">“Para servidores pequeños (&lt;100 clientes), soy más simple.”</w:t>
+      </w:r>
+    </w:p>
+    <w:p>
+      <w:pPr>
+        <w:pStyle w:val="BodyText"/>
+      </w:pPr>
+      <w:r>
+        <w:rPr>
+          <w:b/>
+          <w:bCs/>
+        </w:rPr>
+        <w:t xml:space="preserve">Asyncio</w:t>
+      </w:r>
+      <w:r>
+        <w:t xml:space="preserve">:</w:t>
+      </w:r>
+      <w:r>
+        <w:t xml:space="preserve"> </w:t>
+      </w:r>
+      <w:r>
+        <w:t xml:space="preserve">“Para servidores con mucho I/O y muchas conexiones, soy imbatible.”</w:t>
+      </w:r>
+    </w:p>
+    <w:p>
+      <w:r>
+        <w:pict>
+          <v:rect style="width:0;height:1.5pt" o:hralign="center" o:hrstd="t" o:hr="t"/>
+        </w:pict>
+      </w:r>
+    </w:p>
+    <w:bookmarkEnd w:id="85"/>
+    <w:bookmarkStart w:id="86" w:name="la-tabla-comparativa"/>
+    <w:p>
+      <w:pPr>
+        <w:pStyle w:val="Heading2"/>
+      </w:pPr>
+      <w:r>
+        <w:t xml:space="preserve">⚖️ La tabla comparativa</w:t>
       </w:r>
     </w:p>
     <w:tbl>
@@ -11249,29 +12434,29 @@
               <w:pStyle w:val="Compact"/>
             </w:pPr>
             <w:r>
-              <w:t xml:space="preserve">Intento</w:t>
-            </w:r>
-          </w:p>
-        </w:tc>
-        <w:tc>
-          <w:tcPr/>
-          <w:p>
-            <w:pPr>
-              <w:pStyle w:val="Compact"/>
-            </w:pPr>
-            <w:r>
-              <w:t xml:space="preserve">Espera (2 ** intento)</w:t>
-            </w:r>
-          </w:p>
-        </w:tc>
-        <w:tc>
-          <w:tcPr/>
-          <w:p>
-            <w:pPr>
-              <w:pStyle w:val="Compact"/>
-            </w:pPr>
-            <w:r>
-              <w:t xml:space="preserve">Acumulado</w:t>
+              <w:t xml:space="preserve">Característica</w:t>
+            </w:r>
+          </w:p>
+        </w:tc>
+        <w:tc>
+          <w:tcPr/>
+          <w:p>
+            <w:pPr>
+              <w:pStyle w:val="Compact"/>
+            </w:pPr>
+            <w:r>
+              <w:t xml:space="preserve">Threads</w:t>
+            </w:r>
+          </w:p>
+        </w:tc>
+        <w:tc>
+          <w:tcPr/>
+          <w:p>
+            <w:pPr>
+              <w:pStyle w:val="Compact"/>
+            </w:pPr>
+            <w:r>
+              <w:t xml:space="preserve">Asyncio</w:t>
             </w:r>
           </w:p>
         </w:tc>
@@ -11284,29 +12469,29 @@
               <w:pStyle w:val="Compact"/>
             </w:pPr>
             <w:r>
-              <w:t xml:space="preserve">0</w:t>
-            </w:r>
-          </w:p>
-        </w:tc>
-        <w:tc>
-          <w:tcPr/>
-          <w:p>
-            <w:pPr>
-              <w:pStyle w:val="Compact"/>
-            </w:pPr>
-            <w:r>
-              <w:t xml:space="preserve">1s</w:t>
-            </w:r>
-          </w:p>
-        </w:tc>
-        <w:tc>
-          <w:tcPr/>
-          <w:p>
-            <w:pPr>
-              <w:pStyle w:val="Compact"/>
-            </w:pPr>
-            <w:r>
-              <w:t xml:space="preserve">1s</w:t>
+              <w:t xml:space="preserve">Nº de hilos</w:t>
+            </w:r>
+          </w:p>
+        </w:tc>
+        <w:tc>
+          <w:tcPr/>
+          <w:p>
+            <w:pPr>
+              <w:pStyle w:val="Compact"/>
+            </w:pPr>
+            <w:r>
+              <w:t xml:space="preserve">Varios (gestión del SO)</w:t>
+            </w:r>
+          </w:p>
+        </w:tc>
+        <w:tc>
+          <w:tcPr/>
+          <w:p>
+            <w:pPr>
+              <w:pStyle w:val="Compact"/>
+            </w:pPr>
+            <w:r>
+              <w:t xml:space="preserve">1 (event loop)</w:t>
             </w:r>
           </w:p>
         </w:tc>
@@ -11319,29 +12504,29 @@
               <w:pStyle w:val="Compact"/>
             </w:pPr>
             <w:r>
-              <w:t xml:space="preserve">1</w:t>
-            </w:r>
-          </w:p>
-        </w:tc>
-        <w:tc>
-          <w:tcPr/>
-          <w:p>
-            <w:pPr>
-              <w:pStyle w:val="Compact"/>
-            </w:pPr>
-            <w:r>
-              <w:t xml:space="preserve">2s</w:t>
-            </w:r>
-          </w:p>
-        </w:tc>
-        <w:tc>
-          <w:tcPr/>
-          <w:p>
-            <w:pPr>
-              <w:pStyle w:val="Compact"/>
-            </w:pPr>
-            <w:r>
-              <w:t xml:space="preserve">3s</w:t>
+              <w:t xml:space="preserve">Cambio de contexto</w:t>
+            </w:r>
+          </w:p>
+        </w:tc>
+        <w:tc>
+          <w:tcPr/>
+          <w:p>
+            <w:pPr>
+              <w:pStyle w:val="Compact"/>
+            </w:pPr>
+            <w:r>
+              <w:t xml:space="preserve">Gestionado por el SO</w:t>
+            </w:r>
+          </w:p>
+        </w:tc>
+        <w:tc>
+          <w:tcPr/>
+          <w:p>
+            <w:pPr>
+              <w:pStyle w:val="Compact"/>
+            </w:pPr>
+            <w:r>
+              <w:t xml:space="preserve">Cooperativo (en await)</w:t>
             </w:r>
           </w:p>
         </w:tc>
@@ -11354,29 +12539,29 @@
               <w:pStyle w:val="Compact"/>
             </w:pPr>
             <w:r>
-              <w:t xml:space="preserve">2</w:t>
-            </w:r>
-          </w:p>
-        </w:tc>
-        <w:tc>
-          <w:tcPr/>
-          <w:p>
-            <w:pPr>
-              <w:pStyle w:val="Compact"/>
-            </w:pPr>
-            <w:r>
-              <w:t xml:space="preserve">4s</w:t>
-            </w:r>
-          </w:p>
-        </w:tc>
-        <w:tc>
-          <w:tcPr/>
-          <w:p>
-            <w:pPr>
-              <w:pStyle w:val="Compact"/>
-            </w:pPr>
-            <w:r>
-              <w:t xml:space="preserve">7s</w:t>
+              <w:t xml:space="preserve">Escalabilidad</w:t>
+            </w:r>
+          </w:p>
+        </w:tc>
+        <w:tc>
+          <w:tcPr/>
+          <w:p>
+            <w:pPr>
+              <w:pStyle w:val="Compact"/>
+            </w:pPr>
+            <w:r>
+              <w:t xml:space="preserve">Media (límite de hilos)</w:t>
+            </w:r>
+          </w:p>
+        </w:tc>
+        <w:tc>
+          <w:tcPr/>
+          <w:p>
+            <w:pPr>
+              <w:pStyle w:val="Compact"/>
+            </w:pPr>
+            <w:r>
+              <w:t xml:space="preserve">Alta (miles de conexiones)</w:t>
             </w:r>
           </w:p>
         </w:tc>
@@ -11389,29 +12574,29 @@
               <w:pStyle w:val="Compact"/>
             </w:pPr>
             <w:r>
-              <w:t xml:space="preserve">3</w:t>
-            </w:r>
-          </w:p>
-        </w:tc>
-        <w:tc>
-          <w:tcPr/>
-          <w:p>
-            <w:pPr>
-              <w:pStyle w:val="Compact"/>
-            </w:pPr>
-            <w:r>
-              <w:t xml:space="preserve">8s</w:t>
-            </w:r>
-          </w:p>
-        </w:tc>
-        <w:tc>
-          <w:tcPr/>
-          <w:p>
-            <w:pPr>
-              <w:pStyle w:val="Compact"/>
-            </w:pPr>
-            <w:r>
-              <w:t xml:space="preserve">15s</w:t>
+              <w:t xml:space="preserve">Complejidad</w:t>
+            </w:r>
+          </w:p>
+        </w:tc>
+        <w:tc>
+          <w:tcPr/>
+          <w:p>
+            <w:pPr>
+              <w:pStyle w:val="Compact"/>
+            </w:pPr>
+            <w:r>
+              <w:t xml:space="preserve">Baja (simple)</w:t>
+            </w:r>
+          </w:p>
+        </w:tc>
+        <w:tc>
+          <w:tcPr/>
+          <w:p>
+            <w:pPr>
+              <w:pStyle w:val="Compact"/>
+            </w:pPr>
+            <w:r>
+              <w:t xml:space="preserve">Media (curva de aprendizaje)</w:t>
             </w:r>
           </w:p>
         </w:tc>
@@ -11424,29 +12609,64 @@
               <w:pStyle w:val="Compact"/>
             </w:pPr>
             <w:r>
-              <w:t xml:space="preserve">4</w:t>
-            </w:r>
-          </w:p>
-        </w:tc>
-        <w:tc>
-          <w:tcPr/>
-          <w:p>
-            <w:pPr>
-              <w:pStyle w:val="Compact"/>
-            </w:pPr>
-            <w:r>
-              <w:t xml:space="preserve">16s</w:t>
-            </w:r>
-          </w:p>
-        </w:tc>
-        <w:tc>
-          <w:tcPr/>
-          <w:p>
-            <w:pPr>
-              <w:pStyle w:val="Compact"/>
-            </w:pPr>
-            <w:r>
-              <w:t xml:space="preserve">31s</w:t>
+              <w:t xml:space="preserve">CPU-bound</w:t>
+            </w:r>
+          </w:p>
+        </w:tc>
+        <w:tc>
+          <w:tcPr/>
+          <w:p>
+            <w:pPr>
+              <w:pStyle w:val="Compact"/>
+            </w:pPr>
+            <w:r>
+              <w:t xml:space="preserve">No sirve (GIL)</w:t>
+            </w:r>
+          </w:p>
+        </w:tc>
+        <w:tc>
+          <w:tcPr/>
+          <w:p>
+            <w:pPr>
+              <w:pStyle w:val="Compact"/>
+            </w:pPr>
+            <w:r>
+              <w:t xml:space="preserve">No sirve</w:t>
+            </w:r>
+          </w:p>
+        </w:tc>
+      </w:tr>
+      <w:tr>
+        <w:tc>
+          <w:tcPr/>
+          <w:p>
+            <w:pPr>
+              <w:pStyle w:val="Compact"/>
+            </w:pPr>
+            <w:r>
+              <w:t xml:space="preserve">I/O-bound</w:t>
+            </w:r>
+          </w:p>
+        </w:tc>
+        <w:tc>
+          <w:tcPr/>
+          <w:p>
+            <w:pPr>
+              <w:pStyle w:val="Compact"/>
+            </w:pPr>
+            <w:r>
+              <w:t xml:space="preserve">Sí funciona</w:t>
+            </w:r>
+          </w:p>
+        </w:tc>
+        <w:tc>
+          <w:tcPr/>
+          <w:p>
+            <w:pPr>
+              <w:pStyle w:val="Compact"/>
+            </w:pPr>
+            <w:r>
+              <w:t xml:space="preserve">Excelente</w:t>
             </w:r>
           </w:p>
         </w:tc>
@@ -11454,47 +12674,80 @@
     </w:tbl>
     <w:p>
       <w:pPr>
-        <w:pStyle w:val="BlockText"/>
-      </w:pPr>
-      <w:r>
-        <w:t xml:space="preserve">El</w:t>
-      </w:r>
-      <w:r>
-        <w:t xml:space="preserve"> </w:t>
-      </w:r>
-      <w:r>
-        <w:rPr>
-          <w:b/>
-          <w:bCs/>
-        </w:rPr>
-        <w:t xml:space="preserve">backoff exponencial</w:t>
-      </w:r>
-      <w:r>
-        <w:t xml:space="preserve"> </w:t>
-      </w:r>
-      <w:r>
-        <w:t xml:space="preserve">evita saturar un servidor que ya está teniendo problemas. Es la diferencia entre</w:t>
-      </w:r>
-      <w:r>
-        <w:t xml:space="preserve"> </w:t>
-      </w:r>
-      <w:r>
-        <w:t xml:space="preserve">“un cliente molesto”</w:t>
-      </w:r>
-      <w:r>
-        <w:t xml:space="preserve"> </w:t>
-      </w:r>
-      <w:r>
-        <w:t xml:space="preserve">y</w:t>
-      </w:r>
-      <w:r>
-        <w:t xml:space="preserve"> </w:t>
-      </w:r>
-      <w:r>
-        <w:t xml:space="preserve">“un cliente que remata al servidor”</w:t>
-      </w:r>
-      <w:r>
-        <w:t xml:space="preserve">.</w:t>
+        <w:pStyle w:val="BodyText"/>
+      </w:pPr>
+      <w:r>
+        <w:rPr>
+          <w:b/>
+          <w:bCs/>
+        </w:rPr>
+        <w:t xml:space="preserve">Dos reglas de oro de la tabla:</w:t>
+      </w:r>
+    </w:p>
+    <w:p>
+      <w:pPr>
+        <w:pStyle w:val="Compact"/>
+        <w:numPr>
+          <w:ilvl w:val="0"/>
+          <w:numId w:val="1021"/>
+        </w:numPr>
+      </w:pPr>
+      <w:r>
+        <w:rPr>
+          <w:b/>
+          <w:bCs/>
+        </w:rPr>
+        <w:t xml:space="preserve">I/O-bound</w:t>
+      </w:r>
+      <w:r>
+        <w:t xml:space="preserve"> </w:t>
+      </w:r>
+      <w:r>
+        <w:t xml:space="preserve">(esperas de red, disco, timers): asyncio brilla. Las corrutinas esperan sin ocupar hilos.</w:t>
+      </w:r>
+    </w:p>
+    <w:p>
+      <w:pPr>
+        <w:pStyle w:val="Compact"/>
+        <w:numPr>
+          <w:ilvl w:val="0"/>
+          <w:numId w:val="1021"/>
+        </w:numPr>
+      </w:pPr>
+      <w:r>
+        <w:rPr>
+          <w:b/>
+          <w:bCs/>
+        </w:rPr>
+        <w:t xml:space="preserve">CPU-bound</w:t>
+      </w:r>
+      <w:r>
+        <w:t xml:space="preserve"> </w:t>
+      </w:r>
+      <w:r>
+        <w:t xml:space="preserve">(cálculo puro, bucles pesados): ni threads ni asyncio con el</w:t>
+      </w:r>
+      <w:r>
+        <w:t xml:space="preserve"> </w:t>
+      </w:r>
+      <w:r>
+        <w:rPr>
+          <w:b/>
+          <w:bCs/>
+        </w:rPr>
+        <w:t xml:space="preserve">GIL</w:t>
+      </w:r>
+      <w:r>
+        <w:t xml:space="preserve">. Para eso están los procesos (</w:t>
+      </w:r>
+      <w:r>
+        <w:rPr>
+          <w:rStyle w:val="VerbatimChar"/>
+        </w:rPr>
+        <w:t xml:space="preserve">multiprocessing</w:t>
+      </w:r>
+      <w:r>
+        <w:t xml:space="preserve">, TEMA 01).</w:t>
       </w:r>
     </w:p>
     <w:p>
@@ -11504,304 +12757,14 @@
         </w:pict>
       </w:r>
     </w:p>
-    <w:bookmarkEnd w:id="67"/>
-    <w:bookmarkStart w:id="68" w:name="mini-chequeo-5"/>
+    <w:bookmarkEnd w:id="86"/>
+    <w:bookmarkStart w:id="87" w:name="cuándo-usar-cada-uno"/>
     <w:p>
       <w:pPr>
         <w:pStyle w:val="Heading2"/>
       </w:pPr>
       <w:r>
-        <w:t xml:space="preserve">🧠 Mini-chequeo</w:t>
-      </w:r>
-    </w:p>
-    <w:p>
-      <w:pPr>
-        <w:pStyle w:val="Compact"/>
-        <w:numPr>
-          <w:ilvl w:val="0"/>
-          <w:numId w:val="1018"/>
-        </w:numPr>
-      </w:pPr>
-      <w:r>
-        <w:t xml:space="preserve">¿Qué secuencia de espera genera</w:t>
-      </w:r>
-      <w:r>
-        <w:t xml:space="preserve"> </w:t>
-      </w:r>
-      <w:r>
-        <w:rPr>
-          <w:rStyle w:val="VerbatimChar"/>
-        </w:rPr>
-        <w:t xml:space="preserve">2 ** intento</w:t>
-      </w:r>
-      <w:r>
-        <w:t xml:space="preserve"> </w:t>
-      </w:r>
-      <w:r>
-        <w:t xml:space="preserve">con 4 reintentos?</w:t>
-      </w:r>
-    </w:p>
-    <w:p>
-      <w:pPr>
-        <w:pStyle w:val="Compact"/>
-        <w:numPr>
-          <w:ilvl w:val="0"/>
-          <w:numId w:val="1018"/>
-        </w:numPr>
-      </w:pPr>
-      <w:r>
-        <w:t xml:space="preserve">¿Qué dos excepciones captura el ejemplo?</w:t>
-      </w:r>
-    </w:p>
-    <w:p>
-      <w:pPr>
-        <w:pStyle w:val="Compact"/>
-        <w:numPr>
-          <w:ilvl w:val="0"/>
-          <w:numId w:val="1018"/>
-        </w:numPr>
-      </w:pPr>
-      <w:r>
-        <w:t xml:space="preserve">¿Por qué es mejor que reintentar sin espera?</w:t>
-      </w:r>
-    </w:p>
-    <w:p>
-      <w:pPr>
-        <w:pStyle w:val="FirstParagraph"/>
-      </w:pPr>
-      <w:r>
-        <w:t xml:space="preserve">🔄 Respuestas</w:t>
-      </w:r>
-    </w:p>
-    <w:p>
-      <w:pPr>
-        <w:pStyle w:val="Compact"/>
-        <w:numPr>
-          <w:ilvl w:val="0"/>
-          <w:numId w:val="1019"/>
-        </w:numPr>
-      </w:pPr>
-      <w:r>
-        <w:rPr>
-          <w:b/>
-          <w:bCs/>
-        </w:rPr>
-        <w:t xml:space="preserve">1, 2, 4, 8 segundos</w:t>
-      </w:r>
-      <w:r>
-        <w:t xml:space="preserve"> </w:t>
-      </w:r>
-      <w:r>
-        <w:t xml:space="preserve">(y el siguiente sería 16).</w:t>
-      </w:r>
-    </w:p>
-    <w:p>
-      <w:pPr>
-        <w:pStyle w:val="Compact"/>
-        <w:numPr>
-          <w:ilvl w:val="0"/>
-          <w:numId w:val="1019"/>
-        </w:numPr>
-      </w:pPr>
-      <w:r>
-        <w:rPr>
-          <w:rStyle w:val="VerbatimChar"/>
-          <w:b/>
-          <w:bCs/>
-        </w:rPr>
-        <w:t xml:space="preserve">asyncio.TimeoutError</w:t>
-      </w:r>
-      <w:r>
-        <w:t xml:space="preserve"> </w:t>
-      </w:r>
-      <w:r>
-        <w:t xml:space="preserve">(el</w:t>
-      </w:r>
-      <w:r>
-        <w:t xml:space="preserve"> </w:t>
-      </w:r>
-      <w:r>
-        <w:rPr>
-          <w:rStyle w:val="VerbatimChar"/>
-        </w:rPr>
-        <w:t xml:space="preserve">wait_for</w:t>
-      </w:r>
-      <w:r>
-        <w:t xml:space="preserve"> </w:t>
-      </w:r>
-      <w:r>
-        <w:t xml:space="preserve">de 3s) y</w:t>
-      </w:r>
-      <w:r>
-        <w:t xml:space="preserve"> </w:t>
-      </w:r>
-      <w:r>
-        <w:rPr>
-          <w:rStyle w:val="VerbatimChar"/>
-          <w:b/>
-          <w:bCs/>
-        </w:rPr>
-        <w:t xml:space="preserve">ConnectionRefusedError</w:t>
-      </w:r>
-      <w:r>
-        <w:t xml:space="preserve"> </w:t>
-      </w:r>
-      <w:r>
-        <w:t xml:space="preserve">(el servicio no escucha).</w:t>
-      </w:r>
-    </w:p>
-    <w:p>
-      <w:pPr>
-        <w:pStyle w:val="Compact"/>
-        <w:numPr>
-          <w:ilvl w:val="0"/>
-          <w:numId w:val="1019"/>
-        </w:numPr>
-      </w:pPr>
-      <w:r>
-        <w:t xml:space="preserve">Porque</w:t>
-      </w:r>
-      <w:r>
-        <w:t xml:space="preserve"> </w:t>
-      </w:r>
-      <w:r>
-        <w:rPr>
-          <w:b/>
-          <w:bCs/>
-        </w:rPr>
-        <w:t xml:space="preserve">no machaca al servidor caído</w:t>
-      </w:r>
-      <w:r>
-        <w:t xml:space="preserve">: con espera creciente le das tiempo a recuperarse y a la vez no abandonas. Si se reintenta a saco, se puede hundir el servicio.</w:t>
-      </w:r>
-    </w:p>
-    <w:p>
-      <w:r>
-        <w:pict>
-          <v:rect style="width:0;height:1.5pt" o:hralign="center" o:hrstd="t" o:hr="t"/>
-        </w:pict>
-      </w:r>
-    </w:p>
-    <w:bookmarkEnd w:id="68"/>
-    <w:bookmarkStart w:id="69" w:name="resumen-en-3-frases-5"/>
-    <w:p>
-      <w:pPr>
-        <w:pStyle w:val="Heading2"/>
-      </w:pPr>
-      <w:r>
-        <w:t xml:space="preserve">✅ Resumen en 3 frases</w:t>
-      </w:r>
-    </w:p>
-    <w:p>
-      <w:pPr>
-        <w:pStyle w:val="Compact"/>
-        <w:numPr>
-          <w:ilvl w:val="0"/>
-          <w:numId w:val="1020"/>
-        </w:numPr>
-      </w:pPr>
-      <w:r>
-        <w:t xml:space="preserve">El backoff exponencial reintenta con</w:t>
-      </w:r>
-      <w:r>
-        <w:t xml:space="preserve"> </w:t>
-      </w:r>
-      <w:r>
-        <w:rPr>
-          <w:b/>
-          <w:bCs/>
-        </w:rPr>
-        <w:t xml:space="preserve">espera creciente</w:t>
-      </w:r>
-      <w:r>
-        <w:t xml:space="preserve"> </w:t>
-      </w:r>
-      <w:r>
-        <w:t xml:space="preserve">(</w:t>
-      </w:r>
-      <w:r>
-        <w:rPr>
-          <w:rStyle w:val="VerbatimChar"/>
-        </w:rPr>
-        <w:t xml:space="preserve">2 ** intento</w:t>
-      </w:r>
-      <w:r>
-        <w:t xml:space="preserve">).</w:t>
-      </w:r>
-    </w:p>
-    <w:p>
-      <w:pPr>
-        <w:pStyle w:val="Compact"/>
-        <w:numPr>
-          <w:ilvl w:val="0"/>
-          <w:numId w:val="1020"/>
-        </w:numPr>
-      </w:pPr>
-      <w:r>
-        <w:t xml:space="preserve">Se combina con</w:t>
-      </w:r>
-      <w:r>
-        <w:t xml:space="preserve"> </w:t>
-      </w:r>
-      <w:r>
-        <w:rPr>
-          <w:rStyle w:val="VerbatimChar"/>
-        </w:rPr>
-        <w:t xml:space="preserve">wait_for</w:t>
-      </w:r>
-      <w:r>
-        <w:t xml:space="preserve"> </w:t>
-      </w:r>
-      <w:r>
-        <w:t xml:space="preserve">para que cada intento tenga también un</w:t>
-      </w:r>
-      <w:r>
-        <w:t xml:space="preserve"> </w:t>
-      </w:r>
-      <w:r>
-        <w:rPr>
-          <w:b/>
-          <w:bCs/>
-        </w:rPr>
-        <w:t xml:space="preserve">timeout</w:t>
-      </w:r>
-      <w:r>
-        <w:t xml:space="preserve">.</w:t>
-      </w:r>
-    </w:p>
-    <w:p>
-      <w:pPr>
-        <w:pStyle w:val="Compact"/>
-        <w:numPr>
-          <w:ilvl w:val="0"/>
-          <w:numId w:val="1020"/>
-        </w:numPr>
-      </w:pPr>
-      <w:r>
-        <w:t xml:space="preserve">Es el segundo mecanismo de disponibilidad: el cliente que</w:t>
-      </w:r>
-      <w:r>
-        <w:t xml:space="preserve"> </w:t>
-      </w:r>
-      <w:r>
-        <w:rPr>
-          <w:b/>
-          <w:bCs/>
-        </w:rPr>
-        <w:t xml:space="preserve">aguanta sin machacar</w:t>
-      </w:r>
-      <w:r>
-        <w:t xml:space="preserve">.</w:t>
-      </w:r>
-    </w:p>
-    <w:bookmarkEnd w:id="69"/>
-    <w:bookmarkStart w:id="70" w:name="vocabulario-rápido-5"/>
-    <w:p>
-      <w:pPr>
-        <w:pStyle w:val="Heading2"/>
-      </w:pPr>
-      <w:r>
-        <w:t xml:space="preserve">🐛 Vocabulario rápido</w:t>
+        <w:t xml:space="preserve">🧭 ¿Cuándo usar cada uno?</w:t>
       </w:r>
     </w:p>
     <w:tbl>
@@ -11826,18 +12789,18 @@
               <w:pStyle w:val="Compact"/>
             </w:pPr>
             <w:r>
-              <w:t xml:space="preserve">Término</w:t>
-            </w:r>
-          </w:p>
-        </w:tc>
-        <w:tc>
-          <w:tcPr/>
-          <w:p>
-            <w:pPr>
-              <w:pStyle w:val="Compact"/>
-            </w:pPr>
-            <w:r>
-              <w:t xml:space="preserve">Idea general</w:t>
+              <w:t xml:space="preserve">Situación</w:t>
+            </w:r>
+          </w:p>
+        </w:tc>
+        <w:tc>
+          <w:tcPr/>
+          <w:p>
+            <w:pPr>
+              <w:pStyle w:val="Compact"/>
+            </w:pPr>
+            <w:r>
+              <w:t xml:space="preserve">Elige</w:t>
             </w:r>
           </w:p>
         </w:tc>
@@ -11850,18 +12813,18 @@
               <w:pStyle w:val="Compact"/>
             </w:pPr>
             <w:r>
-              <w:t xml:space="preserve">Backoff</w:t>
-            </w:r>
-          </w:p>
-        </w:tc>
-        <w:tc>
-          <w:tcPr/>
-          <w:p>
-            <w:pPr>
-              <w:pStyle w:val="Compact"/>
-            </w:pPr>
-            <w:r>
-              <w:t xml:space="preserve">Reintento con espera creciente entre intentos</w:t>
+              <w:t xml:space="preserve">Servidor con pocos clientes (&lt; 100) y quieres simplicidad</w:t>
+            </w:r>
+          </w:p>
+        </w:tc>
+        <w:tc>
+          <w:tcPr/>
+          <w:p>
+            <w:pPr>
+              <w:pStyle w:val="Compact"/>
+            </w:pPr>
+            <w:r>
+              <w:t xml:space="preserve">Threads</w:t>
             </w:r>
           </w:p>
         </w:tc>
@@ -11874,18 +12837,22 @@
               <w:pStyle w:val="Compact"/>
             </w:pPr>
             <w:r>
-              <w:t xml:space="preserve">2 ** intento</w:t>
-            </w:r>
-          </w:p>
-        </w:tc>
-        <w:tc>
-          <w:tcPr/>
-          <w:p>
-            <w:pPr>
-              <w:pStyle w:val="Compact"/>
-            </w:pPr>
-            <w:r>
-              <w:t xml:space="preserve">Fórmula de la espera: 1, 2, 4, 8, 16…</w:t>
+              <w:t xml:space="preserve">Servidor con miles de conexiones y mucho I/O</w:t>
+            </w:r>
+          </w:p>
+        </w:tc>
+        <w:tc>
+          <w:tcPr/>
+          <w:p>
+            <w:pPr>
+              <w:pStyle w:val="Compact"/>
+            </w:pPr>
+            <w:r>
+              <w:rPr>
+                <w:b/>
+                <w:bCs/>
+              </w:rPr>
+              <w:t xml:space="preserve">Asyncio</w:t>
             </w:r>
           </w:p>
         </w:tc>
@@ -11898,18 +12865,51 @@
               <w:pStyle w:val="Compact"/>
             </w:pPr>
             <w:r>
-              <w:t xml:space="preserve">ConnectionRefusedError</w:t>
-            </w:r>
-          </w:p>
-        </w:tc>
-        <w:tc>
-          <w:tcPr/>
-          <w:p>
-            <w:pPr>
-              <w:pStyle w:val="Compact"/>
-            </w:pPr>
-            <w:r>
-              <w:t xml:space="preserve">El servicio no escucha en ese puerto</w:t>
+              <w:t xml:space="preserve">Código de terceros bloqueante (</w:t>
+            </w:r>
+            <w:r>
+              <w:rPr>
+                <w:rStyle w:val="VerbatimChar"/>
+              </w:rPr>
+              <w:t xml:space="preserve">requests</w:t>
+            </w:r>
+            <w:r>
+              <w:t xml:space="preserve">,</w:t>
+            </w:r>
+            <w:r>
+              <w:t xml:space="preserve"> </w:t>
+            </w:r>
+            <w:r>
+              <w:rPr>
+                <w:rStyle w:val="VerbatimChar"/>
+              </w:rPr>
+              <w:t xml:space="preserve">time.sleep</w:t>
+            </w:r>
+            <w:r>
+              <w:t xml:space="preserve">)</w:t>
+            </w:r>
+          </w:p>
+        </w:tc>
+        <w:tc>
+          <w:tcPr/>
+          <w:p>
+            <w:pPr>
+              <w:pStyle w:val="Compact"/>
+            </w:pPr>
+            <w:r>
+              <w:t xml:space="preserve">Threads (o</w:t>
+            </w:r>
+            <w:r>
+              <w:t xml:space="preserve"> </w:t>
+            </w:r>
+            <w:r>
+              <w:rPr>
+                <w:rStyle w:val="VerbatimChar"/>
+              </w:rPr>
+              <w:t xml:space="preserve">run_in_executor</w:t>
+            </w:r>
+            <w:r>
+              <w:t xml:space="preserve">)</w:t>
             </w:r>
           </w:p>
         </w:tc>
@@ -11922,18 +12922,31 @@
               <w:pStyle w:val="Compact"/>
             </w:pPr>
             <w:r>
-              <w:t xml:space="preserve">Reintento</w:t>
-            </w:r>
-          </w:p>
-        </w:tc>
-        <w:tc>
-          <w:tcPr/>
-          <w:p>
-            <w:pPr>
-              <w:pStyle w:val="Compact"/>
-            </w:pPr>
-            <w:r>
-              <w:t xml:space="preserve">Nueva tentativa tras un fallo</w:t>
+              <w:t xml:space="preserve">Todo el stack propio, operaciones con</w:t>
+            </w:r>
+            <w:r>
+              <w:t xml:space="preserve"> </w:t>
+            </w:r>
+            <w:r>
+              <w:rPr>
+                <w:rStyle w:val="VerbatimChar"/>
+              </w:rPr>
+              <w:t xml:space="preserve">await</w:t>
+            </w:r>
+          </w:p>
+        </w:tc>
+        <w:tc>
+          <w:tcPr/>
+          <w:p>
+            <w:pPr>
+              <w:pStyle w:val="Compact"/>
+            </w:pPr>
+            <w:r>
+              <w:rPr>
+                <w:b/>
+                <w:bCs/>
+              </w:rPr>
+              <w:t xml:space="preserve">Asyncio</w:t>
             </w:r>
           </w:p>
         </w:tc>
@@ -11946,23 +12959,71 @@
               <w:pStyle w:val="Compact"/>
             </w:pPr>
             <w:r>
-              <w:t xml:space="preserve">Jitter (variación)</w:t>
-            </w:r>
-          </w:p>
-        </w:tc>
-        <w:tc>
-          <w:tcPr/>
-          <w:p>
-            <w:pPr>
-              <w:pStyle w:val="Compact"/>
-            </w:pPr>
-            <w:r>
-              <w:t xml:space="preserve">Añadir aleatoriedad a la espera para evitar avalanchas (tema avanzado)</w:t>
+              <w:t xml:space="preserve">Cálculo intensivo de CPU</w:t>
+            </w:r>
+          </w:p>
+        </w:tc>
+        <w:tc>
+          <w:tcPr/>
+          <w:p>
+            <w:pPr>
+              <w:pStyle w:val="Compact"/>
+            </w:pPr>
+            <w:r>
+              <w:t xml:space="preserve">Ninguno: procesos (multiprocessing)</w:t>
             </w:r>
           </w:p>
         </w:tc>
       </w:tr>
     </w:tbl>
+    <w:p>
+      <w:pPr>
+        <w:pStyle w:val="BlockText"/>
+      </w:pPr>
+      <w:r>
+        <w:t xml:space="preserve">💡 Puedes</w:t>
+      </w:r>
+      <w:r>
+        <w:t xml:space="preserve"> </w:t>
+      </w:r>
+      <w:r>
+        <w:rPr>
+          <w:b/>
+          <w:bCs/>
+        </w:rPr>
+        <w:t xml:space="preserve">mezclar</w:t>
+      </w:r>
+      <w:r>
+        <w:t xml:space="preserve"> </w:t>
+      </w:r>
+      <w:r>
+        <w:t xml:space="preserve">ambos:</w:t>
+      </w:r>
+      <w:r>
+        <w:t xml:space="preserve"> </w:t>
+      </w:r>
+      <w:r>
+        <w:rPr>
+          <w:rStyle w:val="VerbatimChar"/>
+        </w:rPr>
+        <w:t xml:space="preserve">loop.run_in_executor()</w:t>
+      </w:r>
+      <w:r>
+        <w:t xml:space="preserve"> </w:t>
+      </w:r>
+      <w:r>
+        <w:t xml:space="preserve">lleva código bloqueante a un hilo real mientras el event loop sigue. Pero como norma,</w:t>
+      </w:r>
+      <w:r>
+        <w:t xml:space="preserve"> </w:t>
+      </w:r>
+      <w:r>
+        <w:t xml:space="preserve">“mejor si todo es asyncio”</w:t>
+      </w:r>
+      <w:r>
+        <w:t xml:space="preserve">: un solo modelo mental.</w:t>
+      </w:r>
+    </w:p>
     <w:p>
       <w:r>
         <w:pict>
@@ -11970,162 +13031,183 @@
         </w:pict>
       </w:r>
     </w:p>
+    <w:bookmarkEnd w:id="87"/>
+    <w:bookmarkStart w:id="88" w:name="mini-chequeo-6"/>
+    <w:p>
+      <w:pPr>
+        <w:pStyle w:val="Heading2"/>
+      </w:pPr>
+      <w:r>
+        <w:t xml:space="preserve">🧠 Mini-chequeo</w:t>
+      </w:r>
+    </w:p>
+    <w:p>
+      <w:pPr>
+        <w:pStyle w:val="Compact"/>
+        <w:numPr>
+          <w:ilvl w:val="0"/>
+          <w:numId w:val="1022"/>
+        </w:numPr>
+      </w:pPr>
+      <w:r>
+        <w:t xml:space="preserve">¿Quién gestiona el cambio de contexto en threads? ¿Y en asyncio?</w:t>
+      </w:r>
+    </w:p>
+    <w:p>
+      <w:pPr>
+        <w:pStyle w:val="Compact"/>
+        <w:numPr>
+          <w:ilvl w:val="0"/>
+          <w:numId w:val="1022"/>
+        </w:numPr>
+      </w:pPr>
+      <w:r>
+        <w:t xml:space="preserve">¿Por qué asyncio no sirve para CPU-bound?</w:t>
+      </w:r>
+    </w:p>
+    <w:p>
+      <w:pPr>
+        <w:pStyle w:val="Compact"/>
+        <w:numPr>
+          <w:ilvl w:val="0"/>
+          <w:numId w:val="1022"/>
+        </w:numPr>
+      </w:pPr>
+      <w:r>
+        <w:t xml:space="preserve">¿Cuándo es más simple usar threads?</w:t>
+      </w:r>
+    </w:p>
     <w:p>
       <w:pPr>
         <w:pStyle w:val="FirstParagraph"/>
       </w:pPr>
       <w:r>
-        <w:t xml:space="preserve">📚</w:t>
-      </w:r>
-      <w:r>
-        <w:t xml:space="preserve"> </w:t>
-      </w:r>
-      <w:hyperlink r:id="rId31">
-        <w:r>
-          <w:rPr>
-            <w:rStyle w:val="Hyperlink"/>
-          </w:rPr>
-          <w:t xml:space="preserve">Volver al índice de la unidad</w:t>
-        </w:r>
-      </w:hyperlink>
-      <w:r>
-        <w:t xml:space="preserve"> </w:t>
-      </w:r>
-      <w:r>
-        <w:t xml:space="preserve">·</w:t>
-      </w:r>
-      <w:r>
-        <w:t xml:space="preserve"> </w:t>
-      </w:r>
-      <w:r>
-        <w:rPr>
-          <w:b/>
-          <w:bCs/>
-        </w:rPr>
-        <w:t xml:space="preserve">Anterior:</w:t>
-      </w:r>
-      <w:r>
-        <w:t xml:space="preserve"> </w:t>
-      </w:r>
-      <w:hyperlink r:id="rId14">
-        <w:r>
-          <w:rPr>
-            <w:rStyle w:val="Hyperlink"/>
-          </w:rPr>
-          <w:t xml:space="preserve">05 · Heartbeat</w:t>
-        </w:r>
-      </w:hyperlink>
-      <w:r>
-        <w:t xml:space="preserve"> </w:t>
-      </w:r>
-      <w:r>
-        <w:t xml:space="preserve">·</w:t>
-      </w:r>
-      <w:r>
-        <w:t xml:space="preserve"> </w:t>
-      </w:r>
-      <w:r>
-        <w:rPr>
-          <w:b/>
-          <w:bCs/>
-        </w:rPr>
-        <w:t xml:space="preserve">Siguiente:</w:t>
-      </w:r>
-      <w:r>
-        <w:t xml:space="preserve"> </w:t>
-      </w:r>
-      <w:hyperlink r:id="rId16">
-        <w:r>
-          <w:rPr>
-            <w:rStyle w:val="Hyperlink"/>
-          </w:rPr>
-          <w:t xml:space="preserve">07 · Threads vs asyncio</w:t>
-        </w:r>
-      </w:hyperlink>
-    </w:p>
-    <w:bookmarkEnd w:id="70"/>
-    <w:bookmarkEnd w:id="71"/>
-    <w:bookmarkStart w:id="79" w:name="threads-vs-asyncio"/>
-    <w:p>
-      <w:pPr>
-        <w:pStyle w:val="Heading1"/>
-      </w:pPr>
-      <w:r>
-        <w:t xml:space="preserve">07 — Threads vs asyncio</w:t>
-      </w:r>
-    </w:p>
-    <w:p>
-      <w:pPr>
-        <w:pStyle w:val="FirstParagraph"/>
-      </w:pPr>
-      <w:r>
-        <w:t xml:space="preserve">﻿—</w:t>
-      </w:r>
-      <w:r>
-        <w:t xml:space="preserve"> </w:t>
-      </w:r>
-      <w:r>
-        <w:t xml:space="preserve">title: 07 — Threads vs asyncio</w:t>
-      </w:r>
-      <w:r>
-        <w:t xml:space="preserve"> </w:t>
-      </w:r>
-      <w:r>
-        <w:t xml:space="preserve">description: La comparativa definitiva de modelos de concurrencia 🥊</w:t>
-      </w:r>
-      <w:r>
-        <w:t xml:space="preserve"> </w:t>
-      </w:r>
-      <w:r>
-        <w:t xml:space="preserve">—</w:t>
-      </w:r>
-    </w:p>
-    <w:p>
-      <w:pPr>
-        <w:pStyle w:val="BodyText"/>
-      </w:pPr>
-      <w:r>
-        <w:t xml:space="preserve">La comparativa definitiva de modelos de concurrencia 🥊</w:t>
-      </w:r>
-    </w:p>
-    <w:p>
-      <w:pPr>
-        <w:pStyle w:val="BlockText"/>
-      </w:pPr>
-      <w:r>
-        <w:t xml:space="preserve">🗺️</w:t>
-      </w:r>
-      <w:r>
-        <w:t xml:space="preserve"> </w:t>
-      </w:r>
-      <w:r>
-        <w:rPr>
-          <w:b/>
-          <w:bCs/>
-        </w:rPr>
-        <w:t xml:space="preserve">Estás en:</w:t>
-      </w:r>
-      <w:r>
-        <w:t xml:space="preserve"> </w:t>
-      </w:r>
-      <w:r>
-        <w:t xml:space="preserve">⏱️</w:t>
-      </w:r>
-      <w:r>
-        <w:t xml:space="preserve"> </w:t>
-      </w:r>
-      <w:r>
-        <w:rPr>
-          <w:b/>
-          <w:bCs/>
-        </w:rPr>
-        <w:t xml:space="preserve">UD 10 · Alta disponibilidad</w:t>
-      </w:r>
-      <w:r>
-        <w:t xml:space="preserve"> </w:t>
-      </w:r>
-      <w:r>
-        <w:t xml:space="preserve">→ 07 · Threads vs asyncio</w:t>
+        <w:t xml:space="preserve">🔄 Respuestas</w:t>
+      </w:r>
+    </w:p>
+    <w:p>
+      <w:pPr>
+        <w:pStyle w:val="Compact"/>
+        <w:numPr>
+          <w:ilvl w:val="0"/>
+          <w:numId w:val="1023"/>
+        </w:numPr>
+      </w:pPr>
+      <w:r>
+        <w:t xml:space="preserve">En threads,</w:t>
+      </w:r>
+      <w:r>
+        <w:t xml:space="preserve"> </w:t>
+      </w:r>
+      <w:r>
+        <w:rPr>
+          <w:b/>
+          <w:bCs/>
+        </w:rPr>
+        <w:t xml:space="preserve">el sistema operativo</w:t>
+      </w:r>
+      <w:r>
+        <w:t xml:space="preserve">; en asyncio,</w:t>
+      </w:r>
+      <w:r>
+        <w:t xml:space="preserve"> </w:t>
+      </w:r>
+      <w:r>
+        <w:rPr>
+          <w:b/>
+          <w:bCs/>
+        </w:rPr>
+        <w:t xml:space="preserve">el event loop</w:t>
+      </w:r>
+      <w:r>
+        <w:t xml:space="preserve"> </w:t>
+      </w:r>
+      <w:r>
+        <w:t xml:space="preserve">(cooperativo, en cada</w:t>
+      </w:r>
+      <w:r>
+        <w:t xml:space="preserve"> </w:t>
+      </w:r>
+      <w:r>
+        <w:rPr>
+          <w:rStyle w:val="VerbatimChar"/>
+        </w:rPr>
+        <w:t xml:space="preserve">await</w:t>
+      </w:r>
+      <w:r>
+        <w:t xml:space="preserve">).</w:t>
+      </w:r>
+    </w:p>
+    <w:p>
+      <w:pPr>
+        <w:pStyle w:val="Compact"/>
+        <w:numPr>
+          <w:ilvl w:val="0"/>
+          <w:numId w:val="1023"/>
+        </w:numPr>
+      </w:pPr>
+      <w:r>
+        <w:t xml:space="preserve">Por el</w:t>
+      </w:r>
+      <w:r>
+        <w:t xml:space="preserve"> </w:t>
+      </w:r>
+      <w:r>
+        <w:rPr>
+          <w:b/>
+          <w:bCs/>
+        </w:rPr>
+        <w:t xml:space="preserve">GIL</w:t>
+      </w:r>
+      <w:r>
+        <w:t xml:space="preserve"> </w:t>
+      </w:r>
+      <w:r>
+        <w:t xml:space="preserve">(Global Interpreter Lock): las corrutinas se ejecutan en un solo hilo, así que el cálculo pesado no gana nada. Para CPU-bound se usan</w:t>
+      </w:r>
+      <w:r>
+        <w:t xml:space="preserve"> </w:t>
+      </w:r>
+      <w:r>
+        <w:rPr>
+          <w:b/>
+          <w:bCs/>
+        </w:rPr>
+        <w:t xml:space="preserve">procesos</w:t>
+      </w:r>
+      <w:r>
+        <w:t xml:space="preserve"> </w:t>
+      </w:r>
+      <w:r>
+        <w:t xml:space="preserve">(TEMA 01).</w:t>
+      </w:r>
+    </w:p>
+    <w:p>
+      <w:pPr>
+        <w:pStyle w:val="Compact"/>
+        <w:numPr>
+          <w:ilvl w:val="0"/>
+          <w:numId w:val="1023"/>
+        </w:numPr>
+      </w:pPr>
+      <w:r>
+        <w:t xml:space="preserve">Con</w:t>
+      </w:r>
+      <w:r>
+        <w:t xml:space="preserve"> </w:t>
+      </w:r>
+      <w:r>
+        <w:rPr>
+          <w:b/>
+          <w:bCs/>
+        </w:rPr>
+        <w:t xml:space="preserve">pocos clientes</w:t>
+      </w:r>
+      <w:r>
+        <w:t xml:space="preserve"> </w:t>
+      </w:r>
+      <w:r>
+        <w:t xml:space="preserve">(&lt; 100) y operaciones bloqueantes: el modelo mental de un hilo por cliente es más directo que las corrutinas.</w:t>
       </w:r>
     </w:p>
     <w:p>
@@ -12135,554 +13217,14 @@
         </w:pict>
       </w:r>
     </w:p>
-    <w:bookmarkStart w:id="72" w:name="la-idea-en-una-frase-6"/>
+    <w:bookmarkEnd w:id="88"/>
+    <w:bookmarkStart w:id="89" w:name="resumen-en-3-frases-6"/>
     <w:p>
       <w:pPr>
         <w:pStyle w:val="Heading2"/>
       </w:pPr>
       <w:r>
-        <w:t xml:space="preserve">📬 La idea en una frase</w:t>
-      </w:r>
-    </w:p>
-    <w:p>
-      <w:pPr>
-        <w:pStyle w:val="BlockText"/>
-      </w:pPr>
-      <w:r>
-        <w:t xml:space="preserve">Los</w:t>
-      </w:r>
-      <w:r>
-        <w:t xml:space="preserve"> </w:t>
-      </w:r>
-      <w:r>
-        <w:rPr>
-          <w:b/>
-          <w:bCs/>
-        </w:rPr>
-        <w:t xml:space="preserve">hilos</w:t>
-      </w:r>
-      <w:r>
-        <w:t xml:space="preserve"> </w:t>
-      </w:r>
-      <w:r>
-        <w:t xml:space="preserve">son multitarea de verdad gestionada por el SO;</w:t>
-      </w:r>
-      <w:r>
-        <w:t xml:space="preserve"> </w:t>
-      </w:r>
-      <w:r>
-        <w:rPr>
-          <w:b/>
-          <w:bCs/>
-        </w:rPr>
-        <w:t xml:space="preserve">asyncio</w:t>
-      </w:r>
-      <w:r>
-        <w:t xml:space="preserve"> </w:t>
-      </w:r>
-      <w:r>
-        <w:t xml:space="preserve">es multitarea cooperativa en un solo hilo. Para servidores con mucho I/O y miles de conexiones, asyncio gana; para simplicidad con pocos clientes, los hilos.</w:t>
-      </w:r>
-    </w:p>
-    <w:p>
-      <w:r>
-        <w:pict>
-          <v:rect style="width:0;height:1.5pt" o:hralign="center" o:hrstd="t" o:hr="t"/>
-        </w:pict>
-      </w:r>
-    </w:p>
-    <w:bookmarkEnd w:id="72"/>
-    <w:bookmarkStart w:id="73" w:name="el-ring-de-los-conceptos"/>
-    <w:p>
-      <w:pPr>
-        <w:pStyle w:val="Heading2"/>
-      </w:pPr>
-      <w:r>
-        <w:t xml:space="preserve">🥊 El ring de los conceptos</w:t>
-      </w:r>
-    </w:p>
-    <w:p>
-      <w:pPr>
-        <w:pStyle w:val="FirstParagraph"/>
-      </w:pPr>
-      <w:r>
-        <w:rPr>
-          <w:b/>
-          <w:bCs/>
-        </w:rPr>
-        <w:t xml:space="preserve">Thread</w:t>
-      </w:r>
-      <w:r>
-        <w:t xml:space="preserve">:</w:t>
-      </w:r>
-      <w:r>
-        <w:t xml:space="preserve"> </w:t>
-      </w:r>
-      <w:r>
-        <w:t xml:space="preserve">“Yo soy multitarea de verdad. Tengo mi propia pila, mi propio contexto. El SO me gestiona.”</w:t>
-      </w:r>
-    </w:p>
-    <w:p>
-      <w:pPr>
-        <w:pStyle w:val="BodyText"/>
-      </w:pPr>
-      <w:r>
-        <w:rPr>
-          <w:b/>
-          <w:bCs/>
-        </w:rPr>
-        <w:t xml:space="preserve">Asyncio</w:t>
-      </w:r>
-      <w:r>
-        <w:t xml:space="preserve">:</w:t>
-      </w:r>
-      <w:r>
-        <w:t xml:space="preserve"> </w:t>
-      </w:r>
-      <w:r>
-        <w:t xml:space="preserve">“Yo soy multitarea cooperativa. Un solo hilo, pero cambio de tarea cuando una espera.”</w:t>
-      </w:r>
-    </w:p>
-    <w:p>
-      <w:pPr>
-        <w:pStyle w:val="BodyText"/>
-      </w:pPr>
-      <w:r>
-        <w:rPr>
-          <w:b/>
-          <w:bCs/>
-        </w:rPr>
-        <w:t xml:space="preserve">Thread</w:t>
-      </w:r>
-      <w:r>
-        <w:t xml:space="preserve">:</w:t>
-      </w:r>
-      <w:r>
-        <w:t xml:space="preserve"> </w:t>
-      </w:r>
-      <w:r>
-        <w:t xml:space="preserve">“Si tengo 10.000 clientes, creo 10.000 hilos. El sistema sufre.”</w:t>
-      </w:r>
-    </w:p>
-    <w:p>
-      <w:pPr>
-        <w:pStyle w:val="BodyText"/>
-      </w:pPr>
-      <w:r>
-        <w:rPr>
-          <w:b/>
-          <w:bCs/>
-        </w:rPr>
-        <w:t xml:space="preserve">Asyncio</w:t>
-      </w:r>
-      <w:r>
-        <w:t xml:space="preserve">:</w:t>
-      </w:r>
-      <w:r>
-        <w:t xml:space="preserve"> </w:t>
-      </w:r>
-      <w:r>
-        <w:t xml:space="preserve">“Yo con 10.000 clientes uso un hilo y 10.000 corrutinas. Mucho más ligero.”</w:t>
-      </w:r>
-    </w:p>
-    <w:p>
-      <w:pPr>
-        <w:pStyle w:val="BodyText"/>
-      </w:pPr>
-      <w:r>
-        <w:rPr>
-          <w:b/>
-          <w:bCs/>
-        </w:rPr>
-        <w:t xml:space="preserve">Thread</w:t>
-      </w:r>
-      <w:r>
-        <w:t xml:space="preserve">:</w:t>
-      </w:r>
-      <w:r>
-        <w:t xml:space="preserve"> </w:t>
-      </w:r>
-      <w:r>
-        <w:t xml:space="preserve">“Pero mis operaciones son bloqueantes de verdad. Si llamo a</w:t>
-      </w:r>
-      <w:r>
-        <w:t xml:space="preserve"> </w:t>
-      </w:r>
-      <w:r>
-        <w:rPr>
-          <w:rStyle w:val="VerbatimChar"/>
-        </w:rPr>
-        <w:t xml:space="preserve">time.sleep()</w:t>
-      </w:r>
-      <w:r>
-        <w:t xml:space="preserve">, otro hilo ejecuta.”</w:t>
-      </w:r>
-    </w:p>
-    <w:p>
-      <w:pPr>
-        <w:pStyle w:val="BodyText"/>
-      </w:pPr>
-      <w:r>
-        <w:rPr>
-          <w:b/>
-          <w:bCs/>
-        </w:rPr>
-        <w:t xml:space="preserve">Asyncio</w:t>
-      </w:r>
-      <w:r>
-        <w:t xml:space="preserve">:</w:t>
-      </w:r>
-      <w:r>
-        <w:t xml:space="preserve"> </w:t>
-      </w:r>
-      <w:r>
-        <w:t xml:space="preserve">“Mis operaciones son</w:t>
-      </w:r>
-      <w:r>
-        <w:t xml:space="preserve"> </w:t>
-      </w:r>
-      <w:r>
-        <w:rPr>
-          <w:rStyle w:val="VerbatimChar"/>
-        </w:rPr>
-        <w:t xml:space="preserve">await</w:t>
-      </w:r>
-      <w:r>
-        <w:t xml:space="preserve"> </w:t>
-      </w:r>
-      <w:r>
-        <w:t xml:space="preserve">— nunca bloqueo. El event loop decide qué toca.”</w:t>
-      </w:r>
-    </w:p>
-    <w:p>
-      <w:pPr>
-        <w:pStyle w:val="BodyText"/>
-      </w:pPr>
-      <w:r>
-        <w:rPr>
-          <w:b/>
-          <w:bCs/>
-        </w:rPr>
-        <w:t xml:space="preserve">Thread</w:t>
-      </w:r>
-      <w:r>
-        <w:t xml:space="preserve">:</w:t>
-      </w:r>
-      <w:r>
-        <w:t xml:space="preserve"> </w:t>
-      </w:r>
-      <w:r>
-        <w:t xml:space="preserve">“Para servidores pequeños (&lt;100 clientes), soy más simple.”</w:t>
-      </w:r>
-    </w:p>
-    <w:p>
-      <w:pPr>
-        <w:pStyle w:val="BodyText"/>
-      </w:pPr>
-      <w:r>
-        <w:rPr>
-          <w:b/>
-          <w:bCs/>
-        </w:rPr>
-        <w:t xml:space="preserve">Asyncio</w:t>
-      </w:r>
-      <w:r>
-        <w:t xml:space="preserve">:</w:t>
-      </w:r>
-      <w:r>
-        <w:t xml:space="preserve"> </w:t>
-      </w:r>
-      <w:r>
-        <w:t xml:space="preserve">“Para servidores con mucho I/O y muchas conexiones, soy imbatible.”</w:t>
-      </w:r>
-    </w:p>
-    <w:p>
-      <w:r>
-        <w:pict>
-          <v:rect style="width:0;height:1.5pt" o:hralign="center" o:hrstd="t" o:hr="t"/>
-        </w:pict>
-      </w:r>
-    </w:p>
-    <w:bookmarkEnd w:id="73"/>
-    <w:bookmarkStart w:id="74" w:name="la-tabla-comparativa"/>
-    <w:p>
-      <w:pPr>
-        <w:pStyle w:val="Heading2"/>
-      </w:pPr>
-      <w:r>
-        <w:t xml:space="preserve">⚖️ La tabla comparativa</w:t>
-      </w:r>
-    </w:p>
-    <w:tbl>
-      <w:tblPr>
-        <w:tblStyle w:val="Table"/>
-        <w:tblW w:type="auto" w:w="0"/>
-        <w:tblLook w:firstRow="1" w:lastRow="0" w:firstColumn="0" w:lastColumn="0" w:noHBand="0" w:noVBand="0" w:val="0020"/>
-      </w:tblPr>
-      <w:tblGrid>
-        <w:gridCol w:w="2640"/>
-        <w:gridCol w:w="2640"/>
-        <w:gridCol w:w="2640"/>
-      </w:tblGrid>
-      <w:tr>
-        <w:trPr>
-          <w:tblHeader w:val="on"/>
-        </w:trPr>
-        <w:tc>
-          <w:tcPr/>
-          <w:p>
-            <w:pPr>
-              <w:pStyle w:val="Compact"/>
-            </w:pPr>
-            <w:r>
-              <w:t xml:space="preserve">Característica</w:t>
-            </w:r>
-          </w:p>
-        </w:tc>
-        <w:tc>
-          <w:tcPr/>
-          <w:p>
-            <w:pPr>
-              <w:pStyle w:val="Compact"/>
-            </w:pPr>
-            <w:r>
-              <w:t xml:space="preserve">Threads</w:t>
-            </w:r>
-          </w:p>
-        </w:tc>
-        <w:tc>
-          <w:tcPr/>
-          <w:p>
-            <w:pPr>
-              <w:pStyle w:val="Compact"/>
-            </w:pPr>
-            <w:r>
-              <w:t xml:space="preserve">Asyncio</w:t>
-            </w:r>
-          </w:p>
-        </w:tc>
-      </w:tr>
-      <w:tr>
-        <w:tc>
-          <w:tcPr/>
-          <w:p>
-            <w:pPr>
-              <w:pStyle w:val="Compact"/>
-            </w:pPr>
-            <w:r>
-              <w:t xml:space="preserve">Nº de hilos</w:t>
-            </w:r>
-          </w:p>
-        </w:tc>
-        <w:tc>
-          <w:tcPr/>
-          <w:p>
-            <w:pPr>
-              <w:pStyle w:val="Compact"/>
-            </w:pPr>
-            <w:r>
-              <w:t xml:space="preserve">Varios (gestión del SO)</w:t>
-            </w:r>
-          </w:p>
-        </w:tc>
-        <w:tc>
-          <w:tcPr/>
-          <w:p>
-            <w:pPr>
-              <w:pStyle w:val="Compact"/>
-            </w:pPr>
-            <w:r>
-              <w:t xml:space="preserve">1 (event loop)</w:t>
-            </w:r>
-          </w:p>
-        </w:tc>
-      </w:tr>
-      <w:tr>
-        <w:tc>
-          <w:tcPr/>
-          <w:p>
-            <w:pPr>
-              <w:pStyle w:val="Compact"/>
-            </w:pPr>
-            <w:r>
-              <w:t xml:space="preserve">Cambio de contexto</w:t>
-            </w:r>
-          </w:p>
-        </w:tc>
-        <w:tc>
-          <w:tcPr/>
-          <w:p>
-            <w:pPr>
-              <w:pStyle w:val="Compact"/>
-            </w:pPr>
-            <w:r>
-              <w:t xml:space="preserve">Gestionado por el SO</w:t>
-            </w:r>
-          </w:p>
-        </w:tc>
-        <w:tc>
-          <w:tcPr/>
-          <w:p>
-            <w:pPr>
-              <w:pStyle w:val="Compact"/>
-            </w:pPr>
-            <w:r>
-              <w:t xml:space="preserve">Cooperativo (en await)</w:t>
-            </w:r>
-          </w:p>
-        </w:tc>
-      </w:tr>
-      <w:tr>
-        <w:tc>
-          <w:tcPr/>
-          <w:p>
-            <w:pPr>
-              <w:pStyle w:val="Compact"/>
-            </w:pPr>
-            <w:r>
-              <w:t xml:space="preserve">Escalabilidad</w:t>
-            </w:r>
-          </w:p>
-        </w:tc>
-        <w:tc>
-          <w:tcPr/>
-          <w:p>
-            <w:pPr>
-              <w:pStyle w:val="Compact"/>
-            </w:pPr>
-            <w:r>
-              <w:t xml:space="preserve">Media (límite de hilos)</w:t>
-            </w:r>
-          </w:p>
-        </w:tc>
-        <w:tc>
-          <w:tcPr/>
-          <w:p>
-            <w:pPr>
-              <w:pStyle w:val="Compact"/>
-            </w:pPr>
-            <w:r>
-              <w:t xml:space="preserve">Alta (miles de conexiones)</w:t>
-            </w:r>
-          </w:p>
-        </w:tc>
-      </w:tr>
-      <w:tr>
-        <w:tc>
-          <w:tcPr/>
-          <w:p>
-            <w:pPr>
-              <w:pStyle w:val="Compact"/>
-            </w:pPr>
-            <w:r>
-              <w:t xml:space="preserve">Complejidad</w:t>
-            </w:r>
-          </w:p>
-        </w:tc>
-        <w:tc>
-          <w:tcPr/>
-          <w:p>
-            <w:pPr>
-              <w:pStyle w:val="Compact"/>
-            </w:pPr>
-            <w:r>
-              <w:t xml:space="preserve">Baja (simple)</w:t>
-            </w:r>
-          </w:p>
-        </w:tc>
-        <w:tc>
-          <w:tcPr/>
-          <w:p>
-            <w:pPr>
-              <w:pStyle w:val="Compact"/>
-            </w:pPr>
-            <w:r>
-              <w:t xml:space="preserve">Media (curva de aprendizaje)</w:t>
-            </w:r>
-          </w:p>
-        </w:tc>
-      </w:tr>
-      <w:tr>
-        <w:tc>
-          <w:tcPr/>
-          <w:p>
-            <w:pPr>
-              <w:pStyle w:val="Compact"/>
-            </w:pPr>
-            <w:r>
-              <w:t xml:space="preserve">CPU-bound</w:t>
-            </w:r>
-          </w:p>
-        </w:tc>
-        <w:tc>
-          <w:tcPr/>
-          <w:p>
-            <w:pPr>
-              <w:pStyle w:val="Compact"/>
-            </w:pPr>
-            <w:r>
-              <w:t xml:space="preserve">No sirve (GIL)</w:t>
-            </w:r>
-          </w:p>
-        </w:tc>
-        <w:tc>
-          <w:tcPr/>
-          <w:p>
-            <w:pPr>
-              <w:pStyle w:val="Compact"/>
-            </w:pPr>
-            <w:r>
-              <w:t xml:space="preserve">No sirve</w:t>
-            </w:r>
-          </w:p>
-        </w:tc>
-      </w:tr>
-      <w:tr>
-        <w:tc>
-          <w:tcPr/>
-          <w:p>
-            <w:pPr>
-              <w:pStyle w:val="Compact"/>
-            </w:pPr>
-            <w:r>
-              <w:t xml:space="preserve">I/O-bound</w:t>
-            </w:r>
-          </w:p>
-        </w:tc>
-        <w:tc>
-          <w:tcPr/>
-          <w:p>
-            <w:pPr>
-              <w:pStyle w:val="Compact"/>
-            </w:pPr>
-            <w:r>
-              <w:t xml:space="preserve">Sí funciona</w:t>
-            </w:r>
-          </w:p>
-        </w:tc>
-        <w:tc>
-          <w:tcPr/>
-          <w:p>
-            <w:pPr>
-              <w:pStyle w:val="Compact"/>
-            </w:pPr>
-            <w:r>
-              <w:t xml:space="preserve">Excelente</w:t>
-            </w:r>
-          </w:p>
-        </w:tc>
-      </w:tr>
-    </w:tbl>
-    <w:p>
-      <w:pPr>
-        <w:pStyle w:val="BodyText"/>
-      </w:pPr>
-      <w:r>
-        <w:rPr>
-          <w:b/>
-          <w:bCs/>
-        </w:rPr>
-        <w:t xml:space="preserve">Dos reglas de oro de la tabla:</w:t>
+        <w:t xml:space="preserve">✅ Resumen en 3 frases</w:t>
       </w:r>
     </w:p>
     <w:p>
@@ -12690,21 +13232,37 @@
         <w:pStyle w:val="Compact"/>
         <w:numPr>
           <w:ilvl w:val="0"/>
-          <w:numId w:val="1021"/>
+          <w:numId w:val="1024"/>
         </w:numPr>
       </w:pPr>
       <w:r>
-        <w:rPr>
-          <w:b/>
-          <w:bCs/>
-        </w:rPr>
-        <w:t xml:space="preserve">I/O-bound</w:t>
-      </w:r>
-      <w:r>
-        <w:t xml:space="preserve"> </w:t>
-      </w:r>
-      <w:r>
-        <w:t xml:space="preserve">(esperas de red, disco, timers): asyncio brilla. Las corrutinas esperan sin ocupar hilos.</w:t>
+        <w:t xml:space="preserve">Threads =</w:t>
+      </w:r>
+      <w:r>
+        <w:t xml:space="preserve"> </w:t>
+      </w:r>
+      <w:r>
+        <w:rPr>
+          <w:b/>
+          <w:bCs/>
+        </w:rPr>
+        <w:t xml:space="preserve">multitarea del SO</w:t>
+      </w:r>
+      <w:r>
+        <w:t xml:space="preserve">; asyncio =</w:t>
+      </w:r>
+      <w:r>
+        <w:t xml:space="preserve"> </w:t>
+      </w:r>
+      <w:r>
+        <w:rPr>
+          <w:b/>
+          <w:bCs/>
+        </w:rPr>
+        <w:t xml:space="preserve">multitarea cooperativa en un hilo</w:t>
+      </w:r>
+      <w:r>
+        <w:t xml:space="preserve">.</w:t>
       </w:r>
     </w:p>
     <w:p>
@@ -12712,60 +13270,59 @@
         <w:pStyle w:val="Compact"/>
         <w:numPr>
           <w:ilvl w:val="0"/>
-          <w:numId w:val="1021"/>
+          <w:numId w:val="1024"/>
         </w:numPr>
       </w:pPr>
       <w:r>
-        <w:rPr>
-          <w:b/>
-          <w:bCs/>
-        </w:rPr>
-        <w:t xml:space="preserve">CPU-bound</w:t>
-      </w:r>
-      <w:r>
-        <w:t xml:space="preserve"> </w:t>
-      </w:r>
-      <w:r>
-        <w:t xml:space="preserve">(cálculo puro, bucles pesados): ni threads ni asyncio con el</w:t>
-      </w:r>
-      <w:r>
-        <w:t xml:space="preserve"> </w:t>
-      </w:r>
-      <w:r>
-        <w:rPr>
-          <w:b/>
-          <w:bCs/>
-        </w:rPr>
-        <w:t xml:space="preserve">GIL</w:t>
-      </w:r>
-      <w:r>
-        <w:t xml:space="preserve">. Para eso están los procesos (</w:t>
-      </w:r>
-      <w:r>
-        <w:rPr>
-          <w:rStyle w:val="VerbatimChar"/>
-        </w:rPr>
-        <w:t xml:space="preserve">multiprocessing</w:t>
-      </w:r>
-      <w:r>
-        <w:t xml:space="preserve">, TEMA 01).</w:t>
-      </w:r>
-    </w:p>
-    <w:p>
-      <w:r>
-        <w:pict>
-          <v:rect style="width:0;height:1.5pt" o:hralign="center" o:hrstd="t" o:hr="t"/>
-        </w:pict>
-      </w:r>
-    </w:p>
-    <w:bookmarkEnd w:id="74"/>
-    <w:bookmarkStart w:id="75" w:name="cuándo-usar-cada-uno"/>
+        <w:t xml:space="preserve">Para I/O-bound con muchas conexiones,</w:t>
+      </w:r>
+      <w:r>
+        <w:t xml:space="preserve"> </w:t>
+      </w:r>
+      <w:r>
+        <w:rPr>
+          <w:b/>
+          <w:bCs/>
+        </w:rPr>
+        <w:t xml:space="preserve">asyncio es imbatible</w:t>
+      </w:r>
+      <w:r>
+        <w:t xml:space="preserve">; para pocos clientes, los hilos son más simples.</w:t>
+      </w:r>
+    </w:p>
+    <w:p>
+      <w:pPr>
+        <w:pStyle w:val="Compact"/>
+        <w:numPr>
+          <w:ilvl w:val="0"/>
+          <w:numId w:val="1024"/>
+        </w:numPr>
+      </w:pPr>
+      <w:r>
+        <w:t xml:space="preserve">Ninguno sirve para CPU-bound (GIL): ahí mandan los</w:t>
+      </w:r>
+      <w:r>
+        <w:t xml:space="preserve"> </w:t>
+      </w:r>
+      <w:r>
+        <w:rPr>
+          <w:b/>
+          <w:bCs/>
+        </w:rPr>
+        <w:t xml:space="preserve">procesos</w:t>
+      </w:r>
+      <w:r>
+        <w:t xml:space="preserve">.</w:t>
+      </w:r>
+    </w:p>
+    <w:bookmarkEnd w:id="89"/>
+    <w:bookmarkStart w:id="90" w:name="vocabulario-rápido-6"/>
     <w:p>
       <w:pPr>
         <w:pStyle w:val="Heading2"/>
       </w:pPr>
       <w:r>
-        <w:t xml:space="preserve">🧭 ¿Cuándo usar cada uno?</w:t>
+        <w:t xml:space="preserve">🐛 Vocabulario rápido</w:t>
       </w:r>
     </w:p>
     <w:tbl>
@@ -12790,564 +13347,6 @@
               <w:pStyle w:val="Compact"/>
             </w:pPr>
             <w:r>
-              <w:t xml:space="preserve">Situación</w:t>
-            </w:r>
-          </w:p>
-        </w:tc>
-        <w:tc>
-          <w:tcPr/>
-          <w:p>
-            <w:pPr>
-              <w:pStyle w:val="Compact"/>
-            </w:pPr>
-            <w:r>
-              <w:t xml:space="preserve">Elige</w:t>
-            </w:r>
-          </w:p>
-        </w:tc>
-      </w:tr>
-      <w:tr>
-        <w:tc>
-          <w:tcPr/>
-          <w:p>
-            <w:pPr>
-              <w:pStyle w:val="Compact"/>
-            </w:pPr>
-            <w:r>
-              <w:t xml:space="preserve">Servidor con pocos clientes (&lt; 100) y quieres simplicidad</w:t>
-            </w:r>
-          </w:p>
-        </w:tc>
-        <w:tc>
-          <w:tcPr/>
-          <w:p>
-            <w:pPr>
-              <w:pStyle w:val="Compact"/>
-            </w:pPr>
-            <w:r>
-              <w:t xml:space="preserve">Threads</w:t>
-            </w:r>
-          </w:p>
-        </w:tc>
-      </w:tr>
-      <w:tr>
-        <w:tc>
-          <w:tcPr/>
-          <w:p>
-            <w:pPr>
-              <w:pStyle w:val="Compact"/>
-            </w:pPr>
-            <w:r>
-              <w:t xml:space="preserve">Servidor con miles de conexiones y mucho I/O</w:t>
-            </w:r>
-          </w:p>
-        </w:tc>
-        <w:tc>
-          <w:tcPr/>
-          <w:p>
-            <w:pPr>
-              <w:pStyle w:val="Compact"/>
-            </w:pPr>
-            <w:r>
-              <w:rPr>
-                <w:b/>
-                <w:bCs/>
-              </w:rPr>
-              <w:t xml:space="preserve">Asyncio</w:t>
-            </w:r>
-          </w:p>
-        </w:tc>
-      </w:tr>
-      <w:tr>
-        <w:tc>
-          <w:tcPr/>
-          <w:p>
-            <w:pPr>
-              <w:pStyle w:val="Compact"/>
-            </w:pPr>
-            <w:r>
-              <w:t xml:space="preserve">Código de terceros bloqueante (</w:t>
-            </w:r>
-            <w:r>
-              <w:rPr>
-                <w:rStyle w:val="VerbatimChar"/>
-              </w:rPr>
-              <w:t xml:space="preserve">requests</w:t>
-            </w:r>
-            <w:r>
-              <w:t xml:space="preserve">,</w:t>
-            </w:r>
-            <w:r>
-              <w:t xml:space="preserve"> </w:t>
-            </w:r>
-            <w:r>
-              <w:rPr>
-                <w:rStyle w:val="VerbatimChar"/>
-              </w:rPr>
-              <w:t xml:space="preserve">time.sleep</w:t>
-            </w:r>
-            <w:r>
-              <w:t xml:space="preserve">)</w:t>
-            </w:r>
-          </w:p>
-        </w:tc>
-        <w:tc>
-          <w:tcPr/>
-          <w:p>
-            <w:pPr>
-              <w:pStyle w:val="Compact"/>
-            </w:pPr>
-            <w:r>
-              <w:t xml:space="preserve">Threads (o</w:t>
-            </w:r>
-            <w:r>
-              <w:t xml:space="preserve"> </w:t>
-            </w:r>
-            <w:r>
-              <w:rPr>
-                <w:rStyle w:val="VerbatimChar"/>
-              </w:rPr>
-              <w:t xml:space="preserve">run_in_executor</w:t>
-            </w:r>
-            <w:r>
-              <w:t xml:space="preserve">)</w:t>
-            </w:r>
-          </w:p>
-        </w:tc>
-      </w:tr>
-      <w:tr>
-        <w:tc>
-          <w:tcPr/>
-          <w:p>
-            <w:pPr>
-              <w:pStyle w:val="Compact"/>
-            </w:pPr>
-            <w:r>
-              <w:t xml:space="preserve">Todo el stack propio, operaciones con</w:t>
-            </w:r>
-            <w:r>
-              <w:t xml:space="preserve"> </w:t>
-            </w:r>
-            <w:r>
-              <w:rPr>
-                <w:rStyle w:val="VerbatimChar"/>
-              </w:rPr>
-              <w:t xml:space="preserve">await</w:t>
-            </w:r>
-          </w:p>
-        </w:tc>
-        <w:tc>
-          <w:tcPr/>
-          <w:p>
-            <w:pPr>
-              <w:pStyle w:val="Compact"/>
-            </w:pPr>
-            <w:r>
-              <w:rPr>
-                <w:b/>
-                <w:bCs/>
-              </w:rPr>
-              <w:t xml:space="preserve">Asyncio</w:t>
-            </w:r>
-          </w:p>
-        </w:tc>
-      </w:tr>
-      <w:tr>
-        <w:tc>
-          <w:tcPr/>
-          <w:p>
-            <w:pPr>
-              <w:pStyle w:val="Compact"/>
-            </w:pPr>
-            <w:r>
-              <w:t xml:space="preserve">Cálculo intensivo de CPU</w:t>
-            </w:r>
-          </w:p>
-        </w:tc>
-        <w:tc>
-          <w:tcPr/>
-          <w:p>
-            <w:pPr>
-              <w:pStyle w:val="Compact"/>
-            </w:pPr>
-            <w:r>
-              <w:t xml:space="preserve">Ninguno: procesos (multiprocessing)</w:t>
-            </w:r>
-          </w:p>
-        </w:tc>
-      </w:tr>
-    </w:tbl>
-    <w:p>
-      <w:pPr>
-        <w:pStyle w:val="BlockText"/>
-      </w:pPr>
-      <w:r>
-        <w:t xml:space="preserve">💡 Puedes</w:t>
-      </w:r>
-      <w:r>
-        <w:t xml:space="preserve"> </w:t>
-      </w:r>
-      <w:r>
-        <w:rPr>
-          <w:b/>
-          <w:bCs/>
-        </w:rPr>
-        <w:t xml:space="preserve">mezclar</w:t>
-      </w:r>
-      <w:r>
-        <w:t xml:space="preserve"> </w:t>
-      </w:r>
-      <w:r>
-        <w:t xml:space="preserve">ambos:</w:t>
-      </w:r>
-      <w:r>
-        <w:t xml:space="preserve"> </w:t>
-      </w:r>
-      <w:r>
-        <w:rPr>
-          <w:rStyle w:val="VerbatimChar"/>
-        </w:rPr>
-        <w:t xml:space="preserve">loop.run_in_executor()</w:t>
-      </w:r>
-      <w:r>
-        <w:t xml:space="preserve"> </w:t>
-      </w:r>
-      <w:r>
-        <w:t xml:space="preserve">lleva código bloqueante a un hilo real mientras el event loop sigue. Pero como norma,</w:t>
-      </w:r>
-      <w:r>
-        <w:t xml:space="preserve"> </w:t>
-      </w:r>
-      <w:r>
-        <w:t xml:space="preserve">“mejor si todo es asyncio”</w:t>
-      </w:r>
-      <w:r>
-        <w:t xml:space="preserve">: un solo modelo mental.</w:t>
-      </w:r>
-    </w:p>
-    <w:p>
-      <w:r>
-        <w:pict>
-          <v:rect style="width:0;height:1.5pt" o:hralign="center" o:hrstd="t" o:hr="t"/>
-        </w:pict>
-      </w:r>
-    </w:p>
-    <w:bookmarkEnd w:id="75"/>
-    <w:bookmarkStart w:id="76" w:name="mini-chequeo-6"/>
-    <w:p>
-      <w:pPr>
-        <w:pStyle w:val="Heading2"/>
-      </w:pPr>
-      <w:r>
-        <w:t xml:space="preserve">🧠 Mini-chequeo</w:t>
-      </w:r>
-    </w:p>
-    <w:p>
-      <w:pPr>
-        <w:pStyle w:val="Compact"/>
-        <w:numPr>
-          <w:ilvl w:val="0"/>
-          <w:numId w:val="1022"/>
-        </w:numPr>
-      </w:pPr>
-      <w:r>
-        <w:t xml:space="preserve">¿Quién gestiona el cambio de contexto en threads? ¿Y en asyncio?</w:t>
-      </w:r>
-    </w:p>
-    <w:p>
-      <w:pPr>
-        <w:pStyle w:val="Compact"/>
-        <w:numPr>
-          <w:ilvl w:val="0"/>
-          <w:numId w:val="1022"/>
-        </w:numPr>
-      </w:pPr>
-      <w:r>
-        <w:t xml:space="preserve">¿Por qué asyncio no sirve para CPU-bound?</w:t>
-      </w:r>
-    </w:p>
-    <w:p>
-      <w:pPr>
-        <w:pStyle w:val="Compact"/>
-        <w:numPr>
-          <w:ilvl w:val="0"/>
-          <w:numId w:val="1022"/>
-        </w:numPr>
-      </w:pPr>
-      <w:r>
-        <w:t xml:space="preserve">¿Cuándo es más simple usar threads?</w:t>
-      </w:r>
-    </w:p>
-    <w:p>
-      <w:pPr>
-        <w:pStyle w:val="FirstParagraph"/>
-      </w:pPr>
-      <w:r>
-        <w:t xml:space="preserve">🔄 Respuestas</w:t>
-      </w:r>
-    </w:p>
-    <w:p>
-      <w:pPr>
-        <w:pStyle w:val="Compact"/>
-        <w:numPr>
-          <w:ilvl w:val="0"/>
-          <w:numId w:val="1023"/>
-        </w:numPr>
-      </w:pPr>
-      <w:r>
-        <w:t xml:space="preserve">En threads,</w:t>
-      </w:r>
-      <w:r>
-        <w:t xml:space="preserve"> </w:t>
-      </w:r>
-      <w:r>
-        <w:rPr>
-          <w:b/>
-          <w:bCs/>
-        </w:rPr>
-        <w:t xml:space="preserve">el sistema operativo</w:t>
-      </w:r>
-      <w:r>
-        <w:t xml:space="preserve">; en asyncio,</w:t>
-      </w:r>
-      <w:r>
-        <w:t xml:space="preserve"> </w:t>
-      </w:r>
-      <w:r>
-        <w:rPr>
-          <w:b/>
-          <w:bCs/>
-        </w:rPr>
-        <w:t xml:space="preserve">el event loop</w:t>
-      </w:r>
-      <w:r>
-        <w:t xml:space="preserve"> </w:t>
-      </w:r>
-      <w:r>
-        <w:t xml:space="preserve">(cooperativo, en cada</w:t>
-      </w:r>
-      <w:r>
-        <w:t xml:space="preserve"> </w:t>
-      </w:r>
-      <w:r>
-        <w:rPr>
-          <w:rStyle w:val="VerbatimChar"/>
-        </w:rPr>
-        <w:t xml:space="preserve">await</w:t>
-      </w:r>
-      <w:r>
-        <w:t xml:space="preserve">).</w:t>
-      </w:r>
-    </w:p>
-    <w:p>
-      <w:pPr>
-        <w:pStyle w:val="Compact"/>
-        <w:numPr>
-          <w:ilvl w:val="0"/>
-          <w:numId w:val="1023"/>
-        </w:numPr>
-      </w:pPr>
-      <w:r>
-        <w:t xml:space="preserve">Por el</w:t>
-      </w:r>
-      <w:r>
-        <w:t xml:space="preserve"> </w:t>
-      </w:r>
-      <w:r>
-        <w:rPr>
-          <w:b/>
-          <w:bCs/>
-        </w:rPr>
-        <w:t xml:space="preserve">GIL</w:t>
-      </w:r>
-      <w:r>
-        <w:t xml:space="preserve"> </w:t>
-      </w:r>
-      <w:r>
-        <w:t xml:space="preserve">(Global Interpreter Lock): las corrutinas se ejecutan en un solo hilo, así que el cálculo pesado no gana nada. Para CPU-bound se usan</w:t>
-      </w:r>
-      <w:r>
-        <w:t xml:space="preserve"> </w:t>
-      </w:r>
-      <w:r>
-        <w:rPr>
-          <w:b/>
-          <w:bCs/>
-        </w:rPr>
-        <w:t xml:space="preserve">procesos</w:t>
-      </w:r>
-      <w:r>
-        <w:t xml:space="preserve"> </w:t>
-      </w:r>
-      <w:r>
-        <w:t xml:space="preserve">(TEMA 01).</w:t>
-      </w:r>
-    </w:p>
-    <w:p>
-      <w:pPr>
-        <w:pStyle w:val="Compact"/>
-        <w:numPr>
-          <w:ilvl w:val="0"/>
-          <w:numId w:val="1023"/>
-        </w:numPr>
-      </w:pPr>
-      <w:r>
-        <w:t xml:space="preserve">Con</w:t>
-      </w:r>
-      <w:r>
-        <w:t xml:space="preserve"> </w:t>
-      </w:r>
-      <w:r>
-        <w:rPr>
-          <w:b/>
-          <w:bCs/>
-        </w:rPr>
-        <w:t xml:space="preserve">pocos clientes</w:t>
-      </w:r>
-      <w:r>
-        <w:t xml:space="preserve"> </w:t>
-      </w:r>
-      <w:r>
-        <w:t xml:space="preserve">(&lt; 100) y operaciones bloqueantes: el modelo mental de un hilo por cliente es más directo que las corrutinas.</w:t>
-      </w:r>
-    </w:p>
-    <w:p>
-      <w:r>
-        <w:pict>
-          <v:rect style="width:0;height:1.5pt" o:hralign="center" o:hrstd="t" o:hr="t"/>
-        </w:pict>
-      </w:r>
-    </w:p>
-    <w:bookmarkEnd w:id="76"/>
-    <w:bookmarkStart w:id="77" w:name="resumen-en-3-frases-6"/>
-    <w:p>
-      <w:pPr>
-        <w:pStyle w:val="Heading2"/>
-      </w:pPr>
-      <w:r>
-        <w:t xml:space="preserve">✅ Resumen en 3 frases</w:t>
-      </w:r>
-    </w:p>
-    <w:p>
-      <w:pPr>
-        <w:pStyle w:val="Compact"/>
-        <w:numPr>
-          <w:ilvl w:val="0"/>
-          <w:numId w:val="1024"/>
-        </w:numPr>
-      </w:pPr>
-      <w:r>
-        <w:t xml:space="preserve">Threads =</w:t>
-      </w:r>
-      <w:r>
-        <w:t xml:space="preserve"> </w:t>
-      </w:r>
-      <w:r>
-        <w:rPr>
-          <w:b/>
-          <w:bCs/>
-        </w:rPr>
-        <w:t xml:space="preserve">multitarea del SO</w:t>
-      </w:r>
-      <w:r>
-        <w:t xml:space="preserve">; asyncio =</w:t>
-      </w:r>
-      <w:r>
-        <w:t xml:space="preserve"> </w:t>
-      </w:r>
-      <w:r>
-        <w:rPr>
-          <w:b/>
-          <w:bCs/>
-        </w:rPr>
-        <w:t xml:space="preserve">multitarea cooperativa en un hilo</w:t>
-      </w:r>
-      <w:r>
-        <w:t xml:space="preserve">.</w:t>
-      </w:r>
-    </w:p>
-    <w:p>
-      <w:pPr>
-        <w:pStyle w:val="Compact"/>
-        <w:numPr>
-          <w:ilvl w:val="0"/>
-          <w:numId w:val="1024"/>
-        </w:numPr>
-      </w:pPr>
-      <w:r>
-        <w:t xml:space="preserve">Para I/O-bound con muchas conexiones,</w:t>
-      </w:r>
-      <w:r>
-        <w:t xml:space="preserve"> </w:t>
-      </w:r>
-      <w:r>
-        <w:rPr>
-          <w:b/>
-          <w:bCs/>
-        </w:rPr>
-        <w:t xml:space="preserve">asyncio es imbatible</w:t>
-      </w:r>
-      <w:r>
-        <w:t xml:space="preserve">; para pocos clientes, los hilos son más simples.</w:t>
-      </w:r>
-    </w:p>
-    <w:p>
-      <w:pPr>
-        <w:pStyle w:val="Compact"/>
-        <w:numPr>
-          <w:ilvl w:val="0"/>
-          <w:numId w:val="1024"/>
-        </w:numPr>
-      </w:pPr>
-      <w:r>
-        <w:t xml:space="preserve">Ninguno sirve para CPU-bound (GIL): ahí mandan los</w:t>
-      </w:r>
-      <w:r>
-        <w:t xml:space="preserve"> </w:t>
-      </w:r>
-      <w:r>
-        <w:rPr>
-          <w:b/>
-          <w:bCs/>
-        </w:rPr>
-        <w:t xml:space="preserve">procesos</w:t>
-      </w:r>
-      <w:r>
-        <w:t xml:space="preserve">.</w:t>
-      </w:r>
-    </w:p>
-    <w:bookmarkEnd w:id="77"/>
-    <w:bookmarkStart w:id="78" w:name="vocabulario-rápido-6"/>
-    <w:p>
-      <w:pPr>
-        <w:pStyle w:val="Heading2"/>
-      </w:pPr>
-      <w:r>
-        <w:t xml:space="preserve">🐛 Vocabulario rápido</w:t>
-      </w:r>
-    </w:p>
-    <w:tbl>
-      <w:tblPr>
-        <w:tblStyle w:val="Table"/>
-        <w:tblW w:type="pct" w:w="5000"/>
-        <w:tblLayout w:type="fixed"/>
-        <w:tblLook w:firstRow="1" w:lastRow="0" w:firstColumn="0" w:lastColumn="0" w:noHBand="0" w:noVBand="0" w:val="0020"/>
-      </w:tblPr>
-      <w:tblGrid>
-        <w:gridCol w:w="3960"/>
-        <w:gridCol w:w="3960"/>
-      </w:tblGrid>
-      <w:tr>
-        <w:trPr>
-          <w:tblHeader w:val="on"/>
-        </w:trPr>
-        <w:tc>
-          <w:tcPr/>
-          <w:p>
-            <w:pPr>
-              <w:pStyle w:val="Compact"/>
-            </w:pPr>
-            <w:r>
               <w:t xml:space="preserve">Término</w:t>
             </w:r>
           </w:p>
@@ -13589,9 +13588,9 @@
         </w:r>
       </w:hyperlink>
     </w:p>
-    <w:bookmarkEnd w:id="78"/>
-    <w:bookmarkEnd w:id="79"/>
-    <w:bookmarkStart w:id="90" w:name="disponibilidad-y-práctica"/>
+    <w:bookmarkEnd w:id="90"/>
+    <w:bookmarkEnd w:id="91"/>
+    <w:bookmarkStart w:id="102" w:name="disponibilidad-y-práctica"/>
     <w:p>
       <w:pPr>
         <w:pStyle w:val="Heading1"/>
@@ -13687,7 +13686,7 @@
         </w:pict>
       </w:r>
     </w:p>
-    <w:bookmarkStart w:id="80" w:name="la-idea-en-una-frase-7"/>
+    <w:bookmarkStart w:id="92" w:name="la-idea-en-una-frase-7"/>
     <w:p>
       <w:pPr>
         <w:pStyle w:val="Heading2"/>
@@ -13775,8 +13774,8 @@
         </w:pict>
       </w:r>
     </w:p>
-    <w:bookmarkEnd w:id="80"/>
-    <w:bookmarkStart w:id="81" w:name="el-monitor-de-servicio"/>
+    <w:bookmarkEnd w:id="92"/>
+    <w:bookmarkStart w:id="93" w:name="el-monitor-de-servicio"/>
     <w:p>
       <w:pPr>
         <w:pStyle w:val="Heading2"/>
@@ -14869,8 +14868,8 @@
         </w:pict>
       </w:r>
     </w:p>
-    <w:bookmarkEnd w:id="81"/>
-    <w:bookmarkStart w:id="85" w:name="be-the-code-el-event-loop-en-un-servidor"/>
+    <w:bookmarkEnd w:id="93"/>
+    <w:bookmarkStart w:id="97" w:name="be-the-code-el-event-loop-en-un-servidor"/>
     <w:p>
       <w:pPr>
         <w:pStyle w:val="Heading2"/>
@@ -15539,18 +15538,18 @@
           <wp:inline>
             <wp:extent cx="5334000" cy="2506980"/>
             <wp:effectExtent b="0" l="0" r="0" t="0"/>
-            <wp:docPr descr="Diagrama del Event Loop de asyncio: un solo hilo que salta a la siguiente tarea disponible mientras las demás esperan" title="" id="83" name="Picture"/>
+            <wp:docPr descr="Diagrama del Event Loop de asyncio: un solo hilo que salta a la siguiente tarea disponible mientras las demás esperan" title="" id="95" name="Picture"/>
             <a:graphic>
               <a:graphicData uri="http://schemas.openxmlformats.org/drawingml/2006/picture">
                 <pic:pic>
                   <pic:nvPicPr>
-                    <pic:cNvPr descr="C:/Users/serga/Desktop/ApuntesPSP/docx_out/pngs/event-loop.png" id="84" name="Picture"/>
+                    <pic:cNvPr descr="C:/Users/serga/Desktop/ApuntesPSP/docx_out/pngs/event-loop.png" id="96" name="Picture"/>
                     <pic:cNvPicPr>
                       <a:picLocks noChangeArrowheads="1" noChangeAspect="1"/>
                     </pic:cNvPicPr>
                   </pic:nvPicPr>
                   <pic:blipFill>
-                    <a:blip r:embed="rId82"/>
+                    <a:blip r:embed="rId94"/>
                     <a:stretch>
                       <a:fillRect/>
                     </a:stretch>
@@ -15610,8 +15609,8 @@
         </w:pict>
       </w:r>
     </w:p>
-    <w:bookmarkEnd w:id="85"/>
-    <w:bookmarkStart w:id="86" w:name="aprieta-el-lápiz"/>
+    <w:bookmarkEnd w:id="97"/>
+    <w:bookmarkStart w:id="98" w:name="aprieta-el-lápiz"/>
     <w:p>
       <w:pPr>
         <w:pStyle w:val="Heading2"/>
@@ -17487,8 +17486,8 @@
         </w:pict>
       </w:r>
     </w:p>
-    <w:bookmarkEnd w:id="86"/>
-    <w:bookmarkStart w:id="87" w:name="mini-chequeo-7"/>
+    <w:bookmarkEnd w:id="98"/>
+    <w:bookmarkStart w:id="99" w:name="mini-chequeo-7"/>
     <w:p>
       <w:pPr>
         <w:pStyle w:val="Heading2"/>
@@ -17700,8 +17699,8 @@
         </w:pict>
       </w:r>
     </w:p>
-    <w:bookmarkEnd w:id="87"/>
-    <w:bookmarkStart w:id="88" w:name="resumen-en-3-frases-7"/>
+    <w:bookmarkEnd w:id="99"/>
+    <w:bookmarkStart w:id="100" w:name="resumen-en-3-frases-7"/>
     <w:p>
       <w:pPr>
         <w:pStyle w:val="Heading2"/>
@@ -17787,8 +17786,8 @@
         <w:t xml:space="preserve">Con el monitor y el servidor completos, ya tienes el material para el cierre y los boletines.</w:t>
       </w:r>
     </w:p>
-    <w:bookmarkEnd w:id="88"/>
-    <w:bookmarkStart w:id="89" w:name="vocabulario-rápido-7"/>
+    <w:bookmarkEnd w:id="100"/>
+    <w:bookmarkStart w:id="101" w:name="vocabulario-rápido-7"/>
     <w:p>
       <w:pPr>
         <w:pStyle w:val="Heading2"/>
@@ -18036,9 +18035,9 @@
         </w:r>
       </w:hyperlink>
     </w:p>
-    <w:bookmarkEnd w:id="89"/>
-    <w:bookmarkEnd w:id="90"/>
-    <w:bookmarkStart w:id="103" w:name="cierre-consolida-lo-aprendido"/>
+    <w:bookmarkEnd w:id="101"/>
+    <w:bookmarkEnd w:id="102"/>
+    <w:bookmarkStart w:id="115" w:name="cierre-consolida-lo-aprendido"/>
     <w:p>
       <w:pPr>
         <w:pStyle w:val="Heading1"/>
@@ -18166,7 +18165,7 @@
         </w:pict>
       </w:r>
     </w:p>
-    <w:bookmarkStart w:id="91" w:name="sé-la-corrutina"/>
+    <w:bookmarkStart w:id="103" w:name="sé-la-corrutina"/>
     <w:p>
       <w:pPr>
         <w:pStyle w:val="Heading2"/>
@@ -18463,8 +18462,8 @@
         </w:pict>
       </w:r>
     </w:p>
-    <w:bookmarkEnd w:id="91"/>
-    <w:bookmarkStart w:id="92" w:name="fireside-chat-hilos-vs-asyncio"/>
+    <w:bookmarkEnd w:id="103"/>
+    <w:bookmarkStart w:id="104" w:name="fireside-chat-hilos-vs-asyncio"/>
     <w:p>
       <w:pPr>
         <w:pStyle w:val="Heading2"/>
@@ -18654,8 +18653,8 @@
         </w:pict>
       </w:r>
     </w:p>
-    <w:bookmarkEnd w:id="92"/>
-    <w:bookmarkStart w:id="93" w:name="quién-soy"/>
+    <w:bookmarkEnd w:id="104"/>
+    <w:bookmarkStart w:id="105" w:name="quién-soy"/>
     <w:p>
       <w:pPr>
         <w:pStyle w:val="Heading2"/>
@@ -18950,8 +18949,8 @@
         </w:pict>
       </w:r>
     </w:p>
-    <w:bookmarkEnd w:id="93"/>
-    <w:bookmarkStart w:id="94" w:name="X73947843c54de033cd91adc7e39e38d62fe0cfa"/>
+    <w:bookmarkEnd w:id="105"/>
+    <w:bookmarkStart w:id="106" w:name="X73947843c54de033cd91adc7e39e38d62fe0cfa"/>
     <w:p>
       <w:pPr>
         <w:pStyle w:val="Heading2"/>
@@ -19253,8 +19252,8 @@
         </w:pict>
       </w:r>
     </w:p>
-    <w:bookmarkEnd w:id="94"/>
-    <w:bookmarkStart w:id="95" w:name="X955c91d51af38628bbeaf99359e018340713794"/>
+    <w:bookmarkEnd w:id="106"/>
+    <w:bookmarkStart w:id="107" w:name="X955c91d51af38628bbeaf99359e018340713794"/>
     <w:p>
       <w:pPr>
         <w:pStyle w:val="Heading2"/>
@@ -19864,8 +19863,8 @@
         </w:pict>
       </w:r>
     </w:p>
-    <w:bookmarkEnd w:id="95"/>
-    <w:bookmarkStart w:id="96" w:name="logros-de-esta-unidad"/>
+    <w:bookmarkEnd w:id="107"/>
+    <w:bookmarkStart w:id="108" w:name="logros-de-esta-unidad"/>
     <w:p>
       <w:pPr>
         <w:pStyle w:val="Heading2"/>
@@ -20221,8 +20220,8 @@
         </w:pict>
       </w:r>
     </w:p>
-    <w:bookmarkEnd w:id="96"/>
-    <w:bookmarkStart w:id="97" w:name="atrévete-a-pensar"/>
+    <w:bookmarkEnd w:id="108"/>
+    <w:bookmarkStart w:id="109" w:name="atrévete-a-pensar"/>
     <w:p>
       <w:pPr>
         <w:pStyle w:val="Heading2"/>
@@ -20594,8 +20593,8 @@
         </w:pict>
       </w:r>
     </w:p>
-    <w:bookmarkEnd w:id="97"/>
-    <w:bookmarkStart w:id="98" w:name="crucigrama-de-bits"/>
+    <w:bookmarkEnd w:id="109"/>
+    <w:bookmarkStart w:id="110" w:name="crucigrama-de-bits"/>
     <w:p>
       <w:pPr>
         <w:pStyle w:val="Heading2"/>
@@ -20748,8 +20747,8 @@
         </w:pict>
       </w:r>
     </w:p>
-    <w:bookmarkEnd w:id="98"/>
-    <w:bookmarkStart w:id="99" w:name="entrevista-de-trabajo"/>
+    <w:bookmarkEnd w:id="110"/>
+    <w:bookmarkStart w:id="111" w:name="entrevista-de-trabajo"/>
     <w:p>
       <w:pPr>
         <w:pStyle w:val="Heading2"/>
@@ -20997,8 +20996,8 @@
         </w:pict>
       </w:r>
     </w:p>
-    <w:bookmarkEnd w:id="99"/>
-    <w:bookmarkStart w:id="100" w:name="no-hay-preguntas-tontas"/>
+    <w:bookmarkEnd w:id="111"/>
+    <w:bookmarkStart w:id="112" w:name="no-hay-preguntas-tontas"/>
     <w:p>
       <w:pPr>
         <w:pStyle w:val="Heading2"/>
@@ -21306,8 +21305,8 @@
         </w:pict>
       </w:r>
     </w:p>
-    <w:bookmarkEnd w:id="100"/>
-    <w:bookmarkStart w:id="101" w:name="poscréditos"/>
+    <w:bookmarkEnd w:id="112"/>
+    <w:bookmarkStart w:id="113" w:name="poscréditos"/>
     <w:p>
       <w:pPr>
         <w:pStyle w:val="Heading2"/>
@@ -21419,8 +21418,8 @@
         </w:pict>
       </w:r>
     </w:p>
-    <w:bookmarkEnd w:id="101"/>
-    <w:bookmarkStart w:id="102" w:name="X9c623554443b1a1ae96a50a5bdebd0c5f86c1e7"/>
+    <w:bookmarkEnd w:id="113"/>
+    <w:bookmarkStart w:id="114" w:name="X9c623554443b1a1ae96a50a5bdebd0c5f86c1e7"/>
     <w:p>
       <w:pPr>
         <w:pStyle w:val="Heading2"/>
@@ -21671,8 +21670,8 @@
         </w:r>
       </w:hyperlink>
     </w:p>
-    <w:bookmarkEnd w:id="102"/>
-    <w:bookmarkEnd w:id="103"/>
+    <w:bookmarkEnd w:id="114"/>
+    <w:bookmarkEnd w:id="115"/>
     <w:sectPr>
       <w:footnotePr>
         <w:numRestart w:val="eachSect"/>

</xml_diff>